<commit_message>
Add full Colab run: results, figures, executed notebook and completed report
All 9 runs (T4 GPU, 40k/5k/10k, seed 42). Best model by validation macro-F1: CIFG
(test acc 0.8893, macro-F1 0.8614). Report, slides and README filled from results/.

Co-Authored-By: Claude Opus 5.5 <noreply@anthropic.com>
</commit_message>
<xml_diff>
--- a/report/report.docx
+++ b/report/report.docx
@@ -132,7 +132,7 @@
         <w:t xml:space="preserve"> </w:t>
       </w:r>
       <w:r>
-        <w:t xml:space="preserve">initialization is studied one factor at a time.</w:t>
+        <w:t xml:space="preserve">initialization is studied one factor at a time. The final model, selected on validation macro-F1, is</w:t>
       </w:r>
       <w:r>
         <w:t xml:space="preserve"> </w:t>
@@ -142,7 +142,10 @@
           <w:b/>
           <w:bCs/>
         </w:rPr>
-        <w:t xml:space="preserve">[TO FILL AFTER RUN]</w:t>
+        <w:t xml:space="preserve">cifg</w:t>
+      </w:r>
+      <w:r>
+        <w:t xml:space="preserve">, which reaches a test accuracy of 0.889 and a test macro-F1 of 0.861.</w:t>
       </w:r>
     </w:p>
     <w:bookmarkStart w:id="10" w:name="goal-of-the-task"/>
@@ -447,7 +450,7 @@
       <w:r>
         <w:drawing>
           <wp:inline>
-            <wp:extent cx="2770632" cy="1685629"/>
+            <wp:extent cx="2770632" cy="1686330"/>
             <wp:effectExtent b="0" l="0" r="0" t="0"/>
             <wp:docPr descr="image" title="" id="12" name="Picture"/>
             <a:graphic>
@@ -468,7 +471,7 @@
                   <pic:spPr bwMode="auto">
                     <a:xfrm>
                       <a:off x="0" y="0"/>
-                      <a:ext cx="2770632" cy="1685629"/>
+                      <a:ext cx="2770632" cy="1686330"/>
                     </a:xfrm>
                     <a:prstGeom prst="rect">
                       <a:avLst/>
@@ -492,7 +495,7 @@
       <w:r>
         <w:drawing>
           <wp:inline>
-            <wp:extent cx="2770632" cy="1739084"/>
+            <wp:extent cx="2770632" cy="1735777"/>
             <wp:effectExtent b="0" l="0" r="0" t="0"/>
             <wp:docPr descr="image" title="" id="15" name="Picture"/>
             <a:graphic>
@@ -513,7 +516,7 @@
                   <pic:spPr bwMode="auto">
                     <a:xfrm>
                       <a:off x="0" y="0"/>
-                      <a:ext cx="2770632" cy="1739084"/>
+                      <a:ext cx="2770632" cy="1735777"/>
                     </a:xfrm>
                     <a:prstGeom prst="rect">
                       <a:avLst/>
@@ -539,7 +542,7 @@
       <w:r>
         <w:drawing>
           <wp:inline>
-            <wp:extent cx="2770632" cy="1711562"/>
+            <wp:extent cx="2770632" cy="1712336"/>
             <wp:effectExtent b="0" l="0" r="0" t="0"/>
             <wp:docPr descr="image" title="" id="18" name="Picture"/>
             <a:graphic>
@@ -560,7 +563,7 @@
                   <pic:spPr bwMode="auto">
                     <a:xfrm>
                       <a:off x="0" y="0"/>
-                      <a:ext cx="2770632" cy="1711562"/>
+                      <a:ext cx="2770632" cy="1712336"/>
                     </a:xfrm>
                     <a:prstGeom prst="rect">
                       <a:avLst/>
@@ -584,7 +587,7 @@
       <w:r>
         <w:drawing>
           <wp:inline>
-            <wp:extent cx="2487168" cy="1435438"/>
+            <wp:extent cx="2487168" cy="1432146"/>
             <wp:effectExtent b="0" l="0" r="0" t="0"/>
             <wp:docPr descr="image" title="" id="21" name="Picture"/>
             <a:graphic>
@@ -605,7 +608,7 @@
                   <pic:spPr bwMode="auto">
                     <a:xfrm>
                       <a:off x="0" y="0"/>
-                      <a:ext cx="2487168" cy="1435438"/>
+                      <a:ext cx="2487168" cy="1432146"/>
                     </a:xfrm>
                     <a:prstGeom prst="rect">
                       <a:avLst/>
@@ -3310,7 +3313,7 @@
     </w:p>
     <w:bookmarkEnd w:id="31"/>
     <w:bookmarkEnd w:id="32"/>
-    <w:bookmarkStart w:id="38" w:name="hyperparameter-design-choices"/>
+    <w:bookmarkStart w:id="41" w:name="hyperparameter-design-choices"/>
     <w:p>
       <w:pPr>
         <w:pStyle w:val="Heading1"/>
@@ -3427,7 +3430,7 @@
       </w:r>
     </w:p>
     <w:bookmarkEnd w:id="34"/>
-    <w:bookmarkStart w:id="37" w:name="study."/>
+    <w:bookmarkStart w:id="40" w:name="study."/>
     <w:p>
       <w:pPr>
         <w:pStyle w:val="Heading4"/>
@@ -3553,7 +3556,15 @@
         <w:tblCaption w:val="Table 2: Hyperparameter study on the vanilla LSTM (test set; model chosen on validation macro-F1)."/>
       </w:tblPr>
       <w:tblGrid>
-        <w:gridCol w:w="7920"/>
+        <w:gridCol w:w="880"/>
+        <w:gridCol w:w="880"/>
+        <w:gridCol w:w="880"/>
+        <w:gridCol w:w="880"/>
+        <w:gridCol w:w="880"/>
+        <w:gridCol w:w="880"/>
+        <w:gridCol w:w="880"/>
+        <w:gridCol w:w="880"/>
+        <w:gridCol w:w="880"/>
       </w:tblGrid>
       <w:tr>
         <w:trPr>
@@ -3571,66 +3582,950 @@
                 <w:b/>
                 <w:bCs/>
               </w:rPr>
-              <w:t xml:space="preserve">[TO FILL AFTER RUN]</w:t>
-            </w:r>
-          </w:p>
-        </w:tc>
-      </w:tr>
-    </w:tbl>
-    <w:bookmarkEnd w:id="35"/>
-    <w:bookmarkStart w:id="36" w:name="fig:hparams"/>
-    <w:tbl>
-      <w:tblPr>
-        <w:tblStyle w:val="FigureTable"/>
-        <w:tblW w:type="auto" w:w="0"/>
-        <w:jc w:val="center"/>
-        <w:tblLook w:firstRow="0" w:lastRow="0" w:firstColumn="0" w:lastColumn="0"/>
-      </w:tblPr>
-      <w:tblGrid>
-        <w:gridCol w:w="7920"/>
-      </w:tblGrid>
-      <w:tr>
-        <w:tc>
-          <w:tcPr/>
-          <w:p>
-            <w:pPr>
-              <w:jc w:val="center"/>
+              <w:t xml:space="preserve">Vanilla LSTM variant</w:t>
+            </w:r>
+          </w:p>
+        </w:tc>
+        <w:tc>
+          <w:tcPr/>
+          <w:p>
+            <w:pPr>
+              <w:pStyle w:val="Compact"/>
+              <w:jc w:val="right"/>
             </w:pPr>
             <w:r>
               <w:rPr>
                 <w:b/>
                 <w:bCs/>
               </w:rPr>
-              <w:t xml:space="preserve">[TO FILL AFTER RUN: figure hparam_comparison.png]</w:t>
+              <w:t xml:space="preserve">Trainable params</w:t>
+            </w:r>
+          </w:p>
+        </w:tc>
+        <w:tc>
+          <w:tcPr/>
+          <w:p>
+            <w:pPr>
+              <w:pStyle w:val="Compact"/>
+              <w:jc w:val="right"/>
+            </w:pPr>
+            <w:r>
+              <w:rPr>
+                <w:b/>
+                <w:bCs/>
+              </w:rPr>
+              <w:t xml:space="preserve">Recurrent params</w:t>
+            </w:r>
+          </w:p>
+        </w:tc>
+        <w:tc>
+          <w:tcPr/>
+          <w:p>
+            <w:pPr>
+              <w:pStyle w:val="Compact"/>
+              <w:jc w:val="right"/>
+            </w:pPr>
+            <w:r>
+              <w:rPr>
+                <w:b/>
+                <w:bCs/>
+              </w:rPr>
+              <w:t xml:space="preserve">Test acc.</w:t>
+            </w:r>
+          </w:p>
+        </w:tc>
+        <w:tc>
+          <w:tcPr/>
+          <w:p>
+            <w:pPr>
+              <w:pStyle w:val="Compact"/>
+              <w:jc w:val="right"/>
+            </w:pPr>
+            <w:r>
+              <w:rPr>
+                <w:b/>
+                <w:bCs/>
+              </w:rPr>
+              <w:t xml:space="preserve">Test macro-F1</w:t>
+            </w:r>
+          </w:p>
+        </w:tc>
+        <w:tc>
+          <w:tcPr/>
+          <w:p>
+            <w:pPr>
+              <w:pStyle w:val="Compact"/>
+              <w:jc w:val="right"/>
+            </w:pPr>
+            <w:r>
+              <w:rPr>
+                <w:b/>
+                <w:bCs/>
+              </w:rPr>
+              <w:t xml:space="preserve">Precision</w:t>
+            </w:r>
+          </w:p>
+        </w:tc>
+        <w:tc>
+          <w:tcPr/>
+          <w:p>
+            <w:pPr>
+              <w:pStyle w:val="Compact"/>
+              <w:jc w:val="right"/>
+            </w:pPr>
+            <w:r>
+              <w:rPr>
+                <w:b/>
+                <w:bCs/>
+              </w:rPr>
+              <w:t xml:space="preserve">Recall</w:t>
+            </w:r>
+          </w:p>
+        </w:tc>
+        <w:tc>
+          <w:tcPr/>
+          <w:p>
+            <w:pPr>
+              <w:pStyle w:val="Compact"/>
+              <w:jc w:val="right"/>
+            </w:pPr>
+            <w:r>
+              <w:rPr>
+                <w:b/>
+                <w:bCs/>
+              </w:rPr>
+              <w:t xml:space="preserve">Best epoch</w:t>
+            </w:r>
+          </w:p>
+        </w:tc>
+        <w:tc>
+          <w:tcPr/>
+          <w:p>
+            <w:pPr>
+              <w:pStyle w:val="Compact"/>
+              <w:jc w:val="right"/>
+            </w:pPr>
+            <w:r>
+              <w:rPr>
+                <w:b/>
+                <w:bCs/>
+              </w:rPr>
+              <w:t xml:space="preserve">Time/epoch (s)</w:t>
+            </w:r>
+          </w:p>
+        </w:tc>
+      </w:tr>
+      <w:tr>
+        <w:tc>
+          <w:tcPr/>
+          <w:p>
+            <w:pPr>
+              <w:pStyle w:val="Compact"/>
+              <w:jc w:val="left"/>
+            </w:pPr>
+            <w:r>
+              <w:t xml:space="preserve">Baseline (Adam, lr 1e-3, bs 128, Xavier)</w:t>
+            </w:r>
+          </w:p>
+        </w:tc>
+        <w:tc>
+          <w:tcPr/>
+          <w:p>
+            <w:pPr>
+              <w:pStyle w:val="Compact"/>
+              <w:jc w:val="right"/>
+            </w:pPr>
+            <w:r>
+              <w:t xml:space="preserve">2,783,746</w:t>
+            </w:r>
+          </w:p>
+        </w:tc>
+        <w:tc>
+          <w:tcPr/>
+          <w:p>
+            <w:pPr>
+              <w:pStyle w:val="Compact"/>
+              <w:jc w:val="right"/>
+            </w:pPr>
+            <w:r>
+              <w:t xml:space="preserve">394,240</w:t>
+            </w:r>
+          </w:p>
+        </w:tc>
+        <w:tc>
+          <w:tcPr/>
+          <w:p>
+            <w:pPr>
+              <w:pStyle w:val="Compact"/>
+              <w:jc w:val="right"/>
+            </w:pPr>
+            <w:r>
+              <w:t xml:space="preserve">0.8872</w:t>
+            </w:r>
+          </w:p>
+        </w:tc>
+        <w:tc>
+          <w:tcPr/>
+          <w:p>
+            <w:pPr>
+              <w:pStyle w:val="Compact"/>
+              <w:jc w:val="right"/>
+            </w:pPr>
+            <w:r>
+              <w:t xml:space="preserve">0.8561</w:t>
+            </w:r>
+          </w:p>
+        </w:tc>
+        <w:tc>
+          <w:tcPr/>
+          <w:p>
+            <w:pPr>
+              <w:pStyle w:val="Compact"/>
+              <w:jc w:val="right"/>
+            </w:pPr>
+            <w:r>
+              <w:t xml:space="preserve">0.8635</w:t>
+            </w:r>
+          </w:p>
+        </w:tc>
+        <w:tc>
+          <w:tcPr/>
+          <w:p>
+            <w:pPr>
+              <w:pStyle w:val="Compact"/>
+              <w:jc w:val="right"/>
+            </w:pPr>
+            <w:r>
+              <w:t xml:space="preserve">0.8495</w:t>
+            </w:r>
+          </w:p>
+        </w:tc>
+        <w:tc>
+          <w:tcPr/>
+          <w:p>
+            <w:pPr>
+              <w:pStyle w:val="Compact"/>
+              <w:jc w:val="right"/>
+            </w:pPr>
+            <w:r>
+              <w:t xml:space="preserve">8</w:t>
+            </w:r>
+          </w:p>
+        </w:tc>
+        <w:tc>
+          <w:tcPr/>
+          <w:p>
+            <w:pPr>
+              <w:pStyle w:val="Compact"/>
+              <w:jc w:val="right"/>
+            </w:pPr>
+            <w:r>
+              <w:t xml:space="preserve">48.6</w:t>
+            </w:r>
+          </w:p>
+        </w:tc>
+      </w:tr>
+      <w:tr>
+        <w:tc>
+          <w:tcPr/>
+          <w:p>
+            <w:pPr>
+              <w:pStyle w:val="Compact"/>
+              <w:jc w:val="left"/>
+            </w:pPr>
+            <w:r>
+              <w:t xml:space="preserve">Learning rate 5e-3</w:t>
+            </w:r>
+          </w:p>
+        </w:tc>
+        <w:tc>
+          <w:tcPr/>
+          <w:p>
+            <w:pPr>
+              <w:pStyle w:val="Compact"/>
+              <w:jc w:val="right"/>
+            </w:pPr>
+            <w:r>
+              <w:t xml:space="preserve">2,783,746</w:t>
+            </w:r>
+          </w:p>
+        </w:tc>
+        <w:tc>
+          <w:tcPr/>
+          <w:p>
+            <w:pPr>
+              <w:pStyle w:val="Compact"/>
+              <w:jc w:val="right"/>
+            </w:pPr>
+            <w:r>
+              <w:t xml:space="preserve">394,240</w:t>
+            </w:r>
+          </w:p>
+        </w:tc>
+        <w:tc>
+          <w:tcPr/>
+          <w:p>
+            <w:pPr>
+              <w:pStyle w:val="Compact"/>
+              <w:jc w:val="right"/>
+            </w:pPr>
+            <w:r>
+              <w:t xml:space="preserve">0.8857</w:t>
+            </w:r>
+          </w:p>
+        </w:tc>
+        <w:tc>
+          <w:tcPr/>
+          <w:p>
+            <w:pPr>
+              <w:pStyle w:val="Compact"/>
+              <w:jc w:val="right"/>
+            </w:pPr>
+            <w:r>
+              <w:t xml:space="preserve">0.8561</w:t>
+            </w:r>
+          </w:p>
+        </w:tc>
+        <w:tc>
+          <w:tcPr/>
+          <w:p>
+            <w:pPr>
+              <w:pStyle w:val="Compact"/>
+              <w:jc w:val="right"/>
+            </w:pPr>
+            <w:r>
+              <w:t xml:space="preserve">0.8582</w:t>
+            </w:r>
+          </w:p>
+        </w:tc>
+        <w:tc>
+          <w:tcPr/>
+          <w:p>
+            <w:pPr>
+              <w:pStyle w:val="Compact"/>
+              <w:jc w:val="right"/>
+            </w:pPr>
+            <w:r>
+              <w:t xml:space="preserve">0.8541</w:t>
+            </w:r>
+          </w:p>
+        </w:tc>
+        <w:tc>
+          <w:tcPr/>
+          <w:p>
+            <w:pPr>
+              <w:pStyle w:val="Compact"/>
+              <w:jc w:val="right"/>
+            </w:pPr>
+            <w:r>
+              <w:t xml:space="preserve">5</w:t>
+            </w:r>
+          </w:p>
+        </w:tc>
+        <w:tc>
+          <w:tcPr/>
+          <w:p>
+            <w:pPr>
+              <w:pStyle w:val="Compact"/>
+              <w:jc w:val="right"/>
+            </w:pPr>
+            <w:r>
+              <w:t xml:space="preserve">48.4</w:t>
+            </w:r>
+          </w:p>
+        </w:tc>
+      </w:tr>
+      <w:tr>
+        <w:tc>
+          <w:tcPr/>
+          <w:p>
+            <w:pPr>
+              <w:pStyle w:val="Compact"/>
+              <w:jc w:val="left"/>
+            </w:pPr>
+            <w:r>
+              <w:t xml:space="preserve">SGD (momentum 0.9, lr 0.05)</w:t>
+            </w:r>
+          </w:p>
+        </w:tc>
+        <w:tc>
+          <w:tcPr/>
+          <w:p>
+            <w:pPr>
+              <w:pStyle w:val="Compact"/>
+              <w:jc w:val="right"/>
+            </w:pPr>
+            <w:r>
+              <w:t xml:space="preserve">2,783,746</w:t>
+            </w:r>
+          </w:p>
+        </w:tc>
+        <w:tc>
+          <w:tcPr/>
+          <w:p>
+            <w:pPr>
+              <w:pStyle w:val="Compact"/>
+              <w:jc w:val="right"/>
+            </w:pPr>
+            <w:r>
+              <w:t xml:space="preserve">394,240</w:t>
+            </w:r>
+          </w:p>
+        </w:tc>
+        <w:tc>
+          <w:tcPr/>
+          <w:p>
+            <w:pPr>
+              <w:pStyle w:val="Compact"/>
+              <w:jc w:val="right"/>
+            </w:pPr>
+            <w:r>
+              <w:t xml:space="preserve">0.8632</w:t>
+            </w:r>
+          </w:p>
+        </w:tc>
+        <w:tc>
+          <w:tcPr/>
+          <w:p>
+            <w:pPr>
+              <w:pStyle w:val="Compact"/>
+              <w:jc w:val="right"/>
+            </w:pPr>
+            <w:r>
+              <w:t xml:space="preserve">0.8348</w:t>
+            </w:r>
+          </w:p>
+        </w:tc>
+        <w:tc>
+          <w:tcPr/>
+          <w:p>
+            <w:pPr>
+              <w:pStyle w:val="Compact"/>
+              <w:jc w:val="right"/>
+            </w:pPr>
+            <w:r>
+              <w:t xml:space="preserve">0.8249</w:t>
+            </w:r>
+          </w:p>
+        </w:tc>
+        <w:tc>
+          <w:tcPr/>
+          <w:p>
+            <w:pPr>
+              <w:pStyle w:val="Compact"/>
+              <w:jc w:val="right"/>
+            </w:pPr>
+            <w:r>
+              <w:t xml:space="preserve">0.8477</w:t>
+            </w:r>
+          </w:p>
+        </w:tc>
+        <w:tc>
+          <w:tcPr/>
+          <w:p>
+            <w:pPr>
+              <w:pStyle w:val="Compact"/>
+              <w:jc w:val="right"/>
+            </w:pPr>
+            <w:r>
+              <w:t xml:space="preserve">8</w:t>
+            </w:r>
+          </w:p>
+        </w:tc>
+        <w:tc>
+          <w:tcPr/>
+          <w:p>
+            <w:pPr>
+              <w:pStyle w:val="Compact"/>
+              <w:jc w:val="right"/>
+            </w:pPr>
+            <w:r>
+              <w:t xml:space="preserve">48.6</w:t>
+            </w:r>
+          </w:p>
+        </w:tc>
+      </w:tr>
+      <w:tr>
+        <w:tc>
+          <w:tcPr/>
+          <w:p>
+            <w:pPr>
+              <w:pStyle w:val="Compact"/>
+              <w:jc w:val="left"/>
+            </w:pPr>
+            <w:r>
+              <w:t xml:space="preserve">Batch size 64</w:t>
+            </w:r>
+          </w:p>
+        </w:tc>
+        <w:tc>
+          <w:tcPr/>
+          <w:p>
+            <w:pPr>
+              <w:pStyle w:val="Compact"/>
+              <w:jc w:val="right"/>
+            </w:pPr>
+            <w:r>
+              <w:t xml:space="preserve">2,783,746</w:t>
+            </w:r>
+          </w:p>
+        </w:tc>
+        <w:tc>
+          <w:tcPr/>
+          <w:p>
+            <w:pPr>
+              <w:pStyle w:val="Compact"/>
+              <w:jc w:val="right"/>
+            </w:pPr>
+            <w:r>
+              <w:t xml:space="preserve">394,240</w:t>
+            </w:r>
+          </w:p>
+        </w:tc>
+        <w:tc>
+          <w:tcPr/>
+          <w:p>
+            <w:pPr>
+              <w:pStyle w:val="Compact"/>
+              <w:jc w:val="right"/>
+            </w:pPr>
+            <w:r>
+              <w:t xml:space="preserve">0.8838</w:t>
+            </w:r>
+          </w:p>
+        </w:tc>
+        <w:tc>
+          <w:tcPr/>
+          <w:p>
+            <w:pPr>
+              <w:pStyle w:val="Compact"/>
+              <w:jc w:val="right"/>
+            </w:pPr>
+            <w:r>
+              <w:t xml:space="preserve">0.8552</w:t>
+            </w:r>
+          </w:p>
+        </w:tc>
+        <w:tc>
+          <w:tcPr/>
+          <w:p>
+            <w:pPr>
+              <w:pStyle w:val="Compact"/>
+              <w:jc w:val="right"/>
+            </w:pPr>
+            <w:r>
+              <w:t xml:space="preserve">0.8537</w:t>
+            </w:r>
+          </w:p>
+        </w:tc>
+        <w:tc>
+          <w:tcPr/>
+          <w:p>
+            <w:pPr>
+              <w:pStyle w:val="Compact"/>
+              <w:jc w:val="right"/>
+            </w:pPr>
+            <w:r>
+              <w:t xml:space="preserve">0.8568</w:t>
+            </w:r>
+          </w:p>
+        </w:tc>
+        <w:tc>
+          <w:tcPr/>
+          <w:p>
+            <w:pPr>
+              <w:pStyle w:val="Compact"/>
+              <w:jc w:val="right"/>
+            </w:pPr>
+            <w:r>
+              <w:t xml:space="preserve">8</w:t>
+            </w:r>
+          </w:p>
+        </w:tc>
+        <w:tc>
+          <w:tcPr/>
+          <w:p>
+            <w:pPr>
+              <w:pStyle w:val="Compact"/>
+              <w:jc w:val="right"/>
+            </w:pPr>
+            <w:r>
+              <w:t xml:space="preserve">63.5</w:t>
+            </w:r>
+          </w:p>
+        </w:tc>
+      </w:tr>
+      <w:tr>
+        <w:tc>
+          <w:tcPr/>
+          <w:p>
+            <w:pPr>
+              <w:pStyle w:val="Compact"/>
+              <w:jc w:val="left"/>
+            </w:pPr>
+            <w:r>
+              <w:t xml:space="preserve">Batch size 256</w:t>
+            </w:r>
+          </w:p>
+        </w:tc>
+        <w:tc>
+          <w:tcPr/>
+          <w:p>
+            <w:pPr>
+              <w:pStyle w:val="Compact"/>
+              <w:jc w:val="right"/>
+            </w:pPr>
+            <w:r>
+              <w:t xml:space="preserve">2,783,746</w:t>
+            </w:r>
+          </w:p>
+        </w:tc>
+        <w:tc>
+          <w:tcPr/>
+          <w:p>
+            <w:pPr>
+              <w:pStyle w:val="Compact"/>
+              <w:jc w:val="right"/>
+            </w:pPr>
+            <w:r>
+              <w:t xml:space="preserve">394,240</w:t>
+            </w:r>
+          </w:p>
+        </w:tc>
+        <w:tc>
+          <w:tcPr/>
+          <w:p>
+            <w:pPr>
+              <w:pStyle w:val="Compact"/>
+              <w:jc w:val="right"/>
+            </w:pPr>
+            <w:r>
+              <w:t xml:space="preserve">0.8836</w:t>
+            </w:r>
+          </w:p>
+        </w:tc>
+        <w:tc>
+          <w:tcPr/>
+          <w:p>
+            <w:pPr>
+              <w:pStyle w:val="Compact"/>
+              <w:jc w:val="right"/>
+            </w:pPr>
+            <w:r>
+              <w:t xml:space="preserve">0.8511</w:t>
+            </w:r>
+          </w:p>
+        </w:tc>
+        <w:tc>
+          <w:tcPr/>
+          <w:p>
+            <w:pPr>
+              <w:pStyle w:val="Compact"/>
+              <w:jc w:val="right"/>
+            </w:pPr>
+            <w:r>
+              <w:t xml:space="preserve">0.8596</w:t>
+            </w:r>
+          </w:p>
+        </w:tc>
+        <w:tc>
+          <w:tcPr/>
+          <w:p>
+            <w:pPr>
+              <w:pStyle w:val="Compact"/>
+              <w:jc w:val="right"/>
+            </w:pPr>
+            <w:r>
+              <w:t xml:space="preserve">0.8438</w:t>
+            </w:r>
+          </w:p>
+        </w:tc>
+        <w:tc>
+          <w:tcPr/>
+          <w:p>
+            <w:pPr>
+              <w:pStyle w:val="Compact"/>
+              <w:jc w:val="right"/>
+            </w:pPr>
+            <w:r>
+              <w:t xml:space="preserve">8</w:t>
+            </w:r>
+          </w:p>
+        </w:tc>
+        <w:tc>
+          <w:tcPr/>
+          <w:p>
+            <w:pPr>
+              <w:pStyle w:val="Compact"/>
+              <w:jc w:val="right"/>
+            </w:pPr>
+            <w:r>
+              <w:t xml:space="preserve">42.0</w:t>
+            </w:r>
+          </w:p>
+        </w:tc>
+      </w:tr>
+      <w:tr>
+        <w:tc>
+          <w:tcPr/>
+          <w:p>
+            <w:pPr>
+              <w:pStyle w:val="Compact"/>
+              <w:jc w:val="left"/>
+            </w:pPr>
+            <w:r>
+              <w:t xml:space="preserve">Orthogonal recurrent init</w:t>
+            </w:r>
+          </w:p>
+        </w:tc>
+        <w:tc>
+          <w:tcPr/>
+          <w:p>
+            <w:pPr>
+              <w:pStyle w:val="Compact"/>
+              <w:jc w:val="right"/>
+            </w:pPr>
+            <w:r>
+              <w:t xml:space="preserve">2,783,746</w:t>
+            </w:r>
+          </w:p>
+        </w:tc>
+        <w:tc>
+          <w:tcPr/>
+          <w:p>
+            <w:pPr>
+              <w:pStyle w:val="Compact"/>
+              <w:jc w:val="right"/>
+            </w:pPr>
+            <w:r>
+              <w:t xml:space="preserve">394,240</w:t>
+            </w:r>
+          </w:p>
+        </w:tc>
+        <w:tc>
+          <w:tcPr/>
+          <w:p>
+            <w:pPr>
+              <w:pStyle w:val="Compact"/>
+              <w:jc w:val="right"/>
+            </w:pPr>
+            <w:r>
+              <w:t xml:space="preserve">0.8789</w:t>
+            </w:r>
+          </w:p>
+        </w:tc>
+        <w:tc>
+          <w:tcPr/>
+          <w:p>
+            <w:pPr>
+              <w:pStyle w:val="Compact"/>
+              <w:jc w:val="right"/>
+            </w:pPr>
+            <w:r>
+              <w:t xml:space="preserve">0.8467</w:t>
+            </w:r>
+          </w:p>
+        </w:tc>
+        <w:tc>
+          <w:tcPr/>
+          <w:p>
+            <w:pPr>
+              <w:pStyle w:val="Compact"/>
+              <w:jc w:val="right"/>
+            </w:pPr>
+            <w:r>
+              <w:t xml:space="preserve">0.8508</w:t>
+            </w:r>
+          </w:p>
+        </w:tc>
+        <w:tc>
+          <w:tcPr/>
+          <w:p>
+            <w:pPr>
+              <w:pStyle w:val="Compact"/>
+              <w:jc w:val="right"/>
+            </w:pPr>
+            <w:r>
+              <w:t xml:space="preserve">0.8430</w:t>
+            </w:r>
+          </w:p>
+        </w:tc>
+        <w:tc>
+          <w:tcPr/>
+          <w:p>
+            <w:pPr>
+              <w:pStyle w:val="Compact"/>
+              <w:jc w:val="right"/>
+            </w:pPr>
+            <w:r>
+              <w:t xml:space="preserve">4</w:t>
+            </w:r>
+          </w:p>
+        </w:tc>
+        <w:tc>
+          <w:tcPr/>
+          <w:p>
+            <w:pPr>
+              <w:pStyle w:val="Compact"/>
+              <w:jc w:val="right"/>
+            </w:pPr>
+            <w:r>
+              <w:t xml:space="preserve">48.5</w:t>
             </w:r>
           </w:p>
         </w:tc>
       </w:tr>
     </w:tbl>
+    <w:bookmarkEnd w:id="35"/>
+    <w:bookmarkStart w:id="39" w:name="fig:hparams"/>
     <w:p>
       <w:pPr>
+        <w:pStyle w:val="CaptionedFigure"/>
+      </w:pPr>
+      <w:r>
+        <w:drawing>
+          <wp:inline>
+            <wp:extent cx="4315968" cy="1433561"/>
+            <wp:effectExtent b="0" l="0" r="0" t="0"/>
+            <wp:docPr descr="" title="" id="37" name="Picture"/>
+            <a:graphic>
+              <a:graphicData uri="http://schemas.openxmlformats.org/drawingml/2006/picture">
+                <pic:pic>
+                  <pic:nvPicPr>
+                    <pic:cNvPr descr="C:/Users/EIC2000/drug-review-lstm/figures/hparam_comparison.png" id="38" name="Picture"/>
+                    <pic:cNvPicPr>
+                      <a:picLocks noChangeArrowheads="1" noChangeAspect="1"/>
+                    </pic:cNvPicPr>
+                  </pic:nvPicPr>
+                  <pic:blipFill>
+                    <a:blip r:embed="rId36"/>
+                    <a:stretch>
+                      <a:fillRect/>
+                    </a:stretch>
+                  </pic:blipFill>
+                  <pic:spPr bwMode="auto">
+                    <a:xfrm>
+                      <a:off x="0" y="0"/>
+                      <a:ext cx="4315968" cy="1433561"/>
+                    </a:xfrm>
+                    <a:prstGeom prst="rect">
+                      <a:avLst/>
+                    </a:prstGeom>
+                    <a:noFill/>
+                    <a:ln w="9525">
+                      <a:noFill/>
+                      <a:headEnd/>
+                      <a:tailEnd/>
+                    </a:ln>
+                  </pic:spPr>
+                </pic:pic>
+              </a:graphicData>
+            </a:graphic>
+          </wp:inline>
+        </w:drawing>
+      </w:r>
+    </w:p>
+    <w:p>
+      <w:pPr>
         <w:pStyle w:val="ImageCaption"/>
       </w:pPr>
       <w:r>
         <w:t xml:space="preserve">Figure 2: Test macro-F1 of each hyperparameter variant; the dashed line marks the baseline.</w:t>
       </w:r>
     </w:p>
-    <w:bookmarkEnd w:id="36"/>
+    <w:bookmarkEnd w:id="39"/>
     <w:p>
       <w:pPr>
         <w:pStyle w:val="BodyText"/>
       </w:pPr>
+      <w:r>
+        <w:t xml:space="preserve">Relative to the baseline (macro-F1 0.8561):</w:t>
+      </w:r>
+      <w:r>
+        <w:t xml:space="preserve"> </w:t>
+      </w:r>
+      <w:r>
+        <w:rPr>
+          <w:i/>
+          <w:iCs/>
+        </w:rPr>
+        <w:t xml:space="preserve">learning rate</w:t>
+      </w:r>
+      <w:r>
+        <w:t xml:space="preserve">: Learning rate 5e-3 gives 0.8561 (+0.0000), best epoch 5, 48.4 s/epoch.</w:t>
+      </w:r>
+      <w:r>
+        <w:t xml:space="preserve"> </w:t>
+      </w:r>
+      <w:r>
+        <w:rPr>
+          <w:i/>
+          <w:iCs/>
+        </w:rPr>
+        <w:t xml:space="preserve">optimizer</w:t>
+      </w:r>
+      <w:r>
+        <w:t xml:space="preserve">: SGD (momentum 0.9, lr 0.05) gives 0.8348 (-0.0213), best epoch 8, 48.6 s/epoch.</w:t>
+      </w:r>
+      <w:r>
+        <w:t xml:space="preserve"> </w:t>
+      </w:r>
+      <w:r>
+        <w:rPr>
+          <w:i/>
+          <w:iCs/>
+        </w:rPr>
+        <w:t xml:space="preserve">batch size</w:t>
+      </w:r>
+      <w:r>
+        <w:t xml:space="preserve">: Batch size 64 gives 0.8552 (-0.0009), best epoch 8, 63.5 s/epoch.</w:t>
+      </w:r>
+      <w:r>
+        <w:t xml:space="preserve"> </w:t>
+      </w:r>
+      <w:r>
+        <w:rPr>
+          <w:i/>
+          <w:iCs/>
+        </w:rPr>
+        <w:t xml:space="preserve">batch size</w:t>
+      </w:r>
+      <w:r>
+        <w:t xml:space="preserve">: Batch size 256 gives 0.8511 (-0.0050), best epoch 8, 42.0 s/epoch.</w:t>
+      </w:r>
+      <w:r>
+        <w:t xml:space="preserve"> </w:t>
+      </w:r>
+      <w:r>
+        <w:rPr>
+          <w:i/>
+          <w:iCs/>
+        </w:rPr>
+        <w:t xml:space="preserve">initialization</w:t>
+      </w:r>
+      <w:r>
+        <w:t xml:space="preserve">: Orthogonal recurrent init gives 0.8467 (-0.0093), best epoch 4, 48.5 s/epoch. The best setting in this study is</w:t>
+      </w:r>
+      <w:r>
+        <w:t xml:space="preserve"> </w:t>
+      </w:r>
       <w:r>
         <w:rPr>
           <w:b/>
           <w:bCs/>
         </w:rPr>
-        <w:t xml:space="preserve">[TO FILL AFTER RUN]</w:t>
+        <w:t xml:space="preserve">Learning rate 5e-3</w:t>
+      </w:r>
+      <w:r>
+        <w:t xml:space="preserve"> </w:t>
+      </w:r>
+      <w:r>
+        <w:t xml:space="preserve">(0.8561). The baseline (Adam, lr 1e-3) is already a good setting. SGD with momentum is the only clearly worse choice (-0.021 macro-F1), and it is under-fitted rather than overfitted: after 10 epochs its training loss is still about 0.20 (vs 0.02 with Adam) and its validation loss never turns upward, so it converges more slowly within the same epoch budget. A 5x larger Adam learning rate reaches the same macro-F1 three epochs earlier (best epoch 5 vs 8). Batch size mainly trades time for stability: batch 64 matches the baseline but is about 30% slower per epoch, batch 256 is the fastest but loses 0.005. Orthogonal recurrent initialization brought no gain on the test set (-0.009) and early-stopped after 7 epochs; with reviews of about 100 tokens and Adam, its benefit for gradient flow over long sequences is not needed.</w:t>
       </w:r>
     </w:p>
-    <w:bookmarkEnd w:id="37"/>
-    <w:bookmarkEnd w:id="38"/>
-    <w:bookmarkStart w:id="45" w:name="final-model-performance-and-evaluation"/>
+    <w:bookmarkEnd w:id="40"/>
+    <w:bookmarkEnd w:id="41"/>
+    <w:bookmarkStart w:id="57" w:name="final-model-performance-and-evaluation"/>
     <w:p>
       <w:pPr>
         <w:pStyle w:val="Heading1"/>
@@ -3639,7 +4534,7 @@
         <w:t xml:space="preserve">Final model performance and evaluation</w:t>
       </w:r>
     </w:p>
-    <w:bookmarkStart w:id="42" w:name="architecture-comparison."/>
+    <w:bookmarkStart w:id="51" w:name="architecture-comparison."/>
     <w:p>
       <w:pPr>
         <w:pStyle w:val="Heading4"/>
@@ -3656,7 +4551,7 @@
         <w:t xml:space="preserve">Table 3 compares the three cells with identical hyperparameters.</w:t>
       </w:r>
     </w:p>
-    <w:bookmarkStart w:id="39" w:name="tab:arch"/>
+    <w:bookmarkStart w:id="42" w:name="tab:arch"/>
     <w:p>
       <w:pPr>
         <w:pStyle w:val="TableCaption"/>
@@ -3673,7 +4568,15 @@
         <w:tblCaption w:val="Table 3: Architecture comparison on the test set (same splits, seed, hyperparameters and protocol)."/>
       </w:tblPr>
       <w:tblGrid>
-        <w:gridCol w:w="7920"/>
+        <w:gridCol w:w="880"/>
+        <w:gridCol w:w="880"/>
+        <w:gridCol w:w="880"/>
+        <w:gridCol w:w="880"/>
+        <w:gridCol w:w="880"/>
+        <w:gridCol w:w="880"/>
+        <w:gridCol w:w="880"/>
+        <w:gridCol w:w="880"/>
+        <w:gridCol w:w="880"/>
       </w:tblGrid>
       <w:tr>
         <w:trPr>
@@ -3691,101 +4594,593 @@
                 <w:b/>
                 <w:bCs/>
               </w:rPr>
-              <w:t xml:space="preserve">[TO FILL AFTER RUN]</w:t>
-            </w:r>
-          </w:p>
-        </w:tc>
-      </w:tr>
-    </w:tbl>
-    <w:bookmarkEnd w:id="39"/>
-    <w:p>
-      <w:pPr>
-        <w:pStyle w:val="BodyText"/>
-      </w:pPr>
-      <w:r>
-        <w:rPr>
-          <w:b/>
-          <w:bCs/>
-        </w:rPr>
-        <w:t xml:space="preserve">[TO FILL AFTER RUN]</w:t>
-      </w:r>
-    </w:p>
-    <w:bookmarkStart w:id="40" w:name="fig:curves"/>
-    <w:tbl>
-      <w:tblPr>
-        <w:tblStyle w:val="FigureTable"/>
-        <w:tblW w:type="auto" w:w="0"/>
-        <w:jc w:val="center"/>
-        <w:tblLook w:firstRow="0" w:lastRow="0" w:firstColumn="0" w:lastColumn="0"/>
-      </w:tblPr>
-      <w:tblGrid>
-        <w:gridCol w:w="7920"/>
-      </w:tblGrid>
-      <w:tr>
-        <w:tc>
-          <w:tcPr/>
-          <w:p>
-            <w:pPr>
-              <w:jc w:val="center"/>
+              <w:t xml:space="preserve">Model</w:t>
+            </w:r>
+          </w:p>
+        </w:tc>
+        <w:tc>
+          <w:tcPr/>
+          <w:p>
+            <w:pPr>
+              <w:pStyle w:val="Compact"/>
+              <w:jc w:val="right"/>
             </w:pPr>
             <w:r>
               <w:rPr>
                 <w:b/>
                 <w:bCs/>
               </w:rPr>
-              <w:t xml:space="preserve">[TO FILL AFTER RUN: figure val_curves.png]</w:t>
-            </w:r>
-          </w:p>
-        </w:tc>
-      </w:tr>
-    </w:tbl>
-    <w:p>
-      <w:pPr>
-        <w:pStyle w:val="ImageCaption"/>
-      </w:pPr>
-      <w:r>
-        <w:t xml:space="preserve">Figure 3: Validation loss and macro-F1 per epoch for the three cells.</w:t>
-      </w:r>
-    </w:p>
-    <w:bookmarkEnd w:id="40"/>
-    <w:bookmarkStart w:id="41" w:name="fig:params"/>
-    <w:tbl>
-      <w:tblPr>
-        <w:tblStyle w:val="FigureTable"/>
-        <w:tblW w:type="auto" w:w="0"/>
-        <w:jc w:val="center"/>
-        <w:tblLook w:firstRow="0" w:lastRow="0" w:firstColumn="0" w:lastColumn="0"/>
-      </w:tblPr>
-      <w:tblGrid>
-        <w:gridCol w:w="7920"/>
-      </w:tblGrid>
-      <w:tr>
-        <w:tc>
-          <w:tcPr/>
-          <w:p>
-            <w:pPr>
-              <w:jc w:val="center"/>
+              <w:t xml:space="preserve">Trainable params</w:t>
+            </w:r>
+          </w:p>
+        </w:tc>
+        <w:tc>
+          <w:tcPr/>
+          <w:p>
+            <w:pPr>
+              <w:pStyle w:val="Compact"/>
+              <w:jc w:val="right"/>
             </w:pPr>
             <w:r>
               <w:rPr>
                 <w:b/>
                 <w:bCs/>
               </w:rPr>
-              <w:t xml:space="preserve">[TO FILL AFTER RUN: figure params_vs_f1.png]</w:t>
+              <w:t xml:space="preserve">Recurrent params</w:t>
+            </w:r>
+          </w:p>
+        </w:tc>
+        <w:tc>
+          <w:tcPr/>
+          <w:p>
+            <w:pPr>
+              <w:pStyle w:val="Compact"/>
+              <w:jc w:val="right"/>
+            </w:pPr>
+            <w:r>
+              <w:rPr>
+                <w:b/>
+                <w:bCs/>
+              </w:rPr>
+              <w:t xml:space="preserve">Test acc.</w:t>
+            </w:r>
+          </w:p>
+        </w:tc>
+        <w:tc>
+          <w:tcPr/>
+          <w:p>
+            <w:pPr>
+              <w:pStyle w:val="Compact"/>
+              <w:jc w:val="right"/>
+            </w:pPr>
+            <w:r>
+              <w:rPr>
+                <w:b/>
+                <w:bCs/>
+              </w:rPr>
+              <w:t xml:space="preserve">Test macro-F1</w:t>
+            </w:r>
+          </w:p>
+        </w:tc>
+        <w:tc>
+          <w:tcPr/>
+          <w:p>
+            <w:pPr>
+              <w:pStyle w:val="Compact"/>
+              <w:jc w:val="right"/>
+            </w:pPr>
+            <w:r>
+              <w:rPr>
+                <w:b/>
+                <w:bCs/>
+              </w:rPr>
+              <w:t xml:space="preserve">Precision</w:t>
+            </w:r>
+          </w:p>
+        </w:tc>
+        <w:tc>
+          <w:tcPr/>
+          <w:p>
+            <w:pPr>
+              <w:pStyle w:val="Compact"/>
+              <w:jc w:val="right"/>
+            </w:pPr>
+            <w:r>
+              <w:rPr>
+                <w:b/>
+                <w:bCs/>
+              </w:rPr>
+              <w:t xml:space="preserve">Recall</w:t>
+            </w:r>
+          </w:p>
+        </w:tc>
+        <w:tc>
+          <w:tcPr/>
+          <w:p>
+            <w:pPr>
+              <w:pStyle w:val="Compact"/>
+              <w:jc w:val="right"/>
+            </w:pPr>
+            <w:r>
+              <w:rPr>
+                <w:b/>
+                <w:bCs/>
+              </w:rPr>
+              <w:t xml:space="preserve">Best epoch</w:t>
+            </w:r>
+          </w:p>
+        </w:tc>
+        <w:tc>
+          <w:tcPr/>
+          <w:p>
+            <w:pPr>
+              <w:pStyle w:val="Compact"/>
+              <w:jc w:val="right"/>
+            </w:pPr>
+            <w:r>
+              <w:rPr>
+                <w:b/>
+                <w:bCs/>
+              </w:rPr>
+              <w:t xml:space="preserve">Time/epoch (s)</w:t>
+            </w:r>
+          </w:p>
+        </w:tc>
+      </w:tr>
+      <w:tr>
+        <w:tc>
+          <w:tcPr/>
+          <w:p>
+            <w:pPr>
+              <w:pStyle w:val="Compact"/>
+              <w:jc w:val="left"/>
+            </w:pPr>
+            <w:r>
+              <w:t xml:space="preserve">Vanilla LSTM</w:t>
+            </w:r>
+          </w:p>
+        </w:tc>
+        <w:tc>
+          <w:tcPr/>
+          <w:p>
+            <w:pPr>
+              <w:pStyle w:val="Compact"/>
+              <w:jc w:val="right"/>
+            </w:pPr>
+            <w:r>
+              <w:t xml:space="preserve">2,783,746</w:t>
+            </w:r>
+          </w:p>
+        </w:tc>
+        <w:tc>
+          <w:tcPr/>
+          <w:p>
+            <w:pPr>
+              <w:pStyle w:val="Compact"/>
+              <w:jc w:val="right"/>
+            </w:pPr>
+            <w:r>
+              <w:t xml:space="preserve">394,240</w:t>
+            </w:r>
+          </w:p>
+        </w:tc>
+        <w:tc>
+          <w:tcPr/>
+          <w:p>
+            <w:pPr>
+              <w:pStyle w:val="Compact"/>
+              <w:jc w:val="right"/>
+            </w:pPr>
+            <w:r>
+              <w:t xml:space="preserve">0.8872</w:t>
+            </w:r>
+          </w:p>
+        </w:tc>
+        <w:tc>
+          <w:tcPr/>
+          <w:p>
+            <w:pPr>
+              <w:pStyle w:val="Compact"/>
+              <w:jc w:val="right"/>
+            </w:pPr>
+            <w:r>
+              <w:t xml:space="preserve">0.8561</w:t>
+            </w:r>
+          </w:p>
+        </w:tc>
+        <w:tc>
+          <w:tcPr/>
+          <w:p>
+            <w:pPr>
+              <w:pStyle w:val="Compact"/>
+              <w:jc w:val="right"/>
+            </w:pPr>
+            <w:r>
+              <w:t xml:space="preserve">0.8635</w:t>
+            </w:r>
+          </w:p>
+        </w:tc>
+        <w:tc>
+          <w:tcPr/>
+          <w:p>
+            <w:pPr>
+              <w:pStyle w:val="Compact"/>
+              <w:jc w:val="right"/>
+            </w:pPr>
+            <w:r>
+              <w:t xml:space="preserve">0.8495</w:t>
+            </w:r>
+          </w:p>
+        </w:tc>
+        <w:tc>
+          <w:tcPr/>
+          <w:p>
+            <w:pPr>
+              <w:pStyle w:val="Compact"/>
+              <w:jc w:val="right"/>
+            </w:pPr>
+            <w:r>
+              <w:t xml:space="preserve">8</w:t>
+            </w:r>
+          </w:p>
+        </w:tc>
+        <w:tc>
+          <w:tcPr/>
+          <w:p>
+            <w:pPr>
+              <w:pStyle w:val="Compact"/>
+              <w:jc w:val="right"/>
+            </w:pPr>
+            <w:r>
+              <w:t xml:space="preserve">48.6</w:t>
+            </w:r>
+          </w:p>
+        </w:tc>
+      </w:tr>
+      <w:tr>
+        <w:tc>
+          <w:tcPr/>
+          <w:p>
+            <w:pPr>
+              <w:pStyle w:val="Compact"/>
+              <w:jc w:val="left"/>
+            </w:pPr>
+            <w:r>
+              <w:t xml:space="preserve">CIFG-LSTM</w:t>
+            </w:r>
+          </w:p>
+        </w:tc>
+        <w:tc>
+          <w:tcPr/>
+          <w:p>
+            <w:pPr>
+              <w:pStyle w:val="Compact"/>
+              <w:jc w:val="right"/>
+            </w:pPr>
+            <w:r>
+              <w:t xml:space="preserve">2,685,186</w:t>
+            </w:r>
+          </w:p>
+        </w:tc>
+        <w:tc>
+          <w:tcPr/>
+          <w:p>
+            <w:pPr>
+              <w:pStyle w:val="Compact"/>
+              <w:jc w:val="right"/>
+            </w:pPr>
+            <w:r>
+              <w:t xml:space="preserve">295,680</w:t>
+            </w:r>
+          </w:p>
+        </w:tc>
+        <w:tc>
+          <w:tcPr/>
+          <w:p>
+            <w:pPr>
+              <w:pStyle w:val="Compact"/>
+              <w:jc w:val="right"/>
+            </w:pPr>
+            <w:r>
+              <w:t xml:space="preserve">0.8893</w:t>
+            </w:r>
+          </w:p>
+        </w:tc>
+        <w:tc>
+          <w:tcPr/>
+          <w:p>
+            <w:pPr>
+              <w:pStyle w:val="Compact"/>
+              <w:jc w:val="right"/>
+            </w:pPr>
+            <w:r>
+              <w:t xml:space="preserve">0.8614</w:t>
+            </w:r>
+          </w:p>
+        </w:tc>
+        <w:tc>
+          <w:tcPr/>
+          <w:p>
+            <w:pPr>
+              <w:pStyle w:val="Compact"/>
+              <w:jc w:val="right"/>
+            </w:pPr>
+            <w:r>
+              <w:t xml:space="preserve">0.8616</w:t>
+            </w:r>
+          </w:p>
+        </w:tc>
+        <w:tc>
+          <w:tcPr/>
+          <w:p>
+            <w:pPr>
+              <w:pStyle w:val="Compact"/>
+              <w:jc w:val="right"/>
+            </w:pPr>
+            <w:r>
+              <w:t xml:space="preserve">0.8612</w:t>
+            </w:r>
+          </w:p>
+        </w:tc>
+        <w:tc>
+          <w:tcPr/>
+          <w:p>
+            <w:pPr>
+              <w:pStyle w:val="Compact"/>
+              <w:jc w:val="right"/>
+            </w:pPr>
+            <w:r>
+              <w:t xml:space="preserve">6</w:t>
+            </w:r>
+          </w:p>
+        </w:tc>
+        <w:tc>
+          <w:tcPr/>
+          <w:p>
+            <w:pPr>
+              <w:pStyle w:val="Compact"/>
+              <w:jc w:val="right"/>
+            </w:pPr>
+            <w:r>
+              <w:t xml:space="preserve">41.1</w:t>
+            </w:r>
+          </w:p>
+        </w:tc>
+      </w:tr>
+      <w:tr>
+        <w:tc>
+          <w:tcPr/>
+          <w:p>
+            <w:pPr>
+              <w:pStyle w:val="Compact"/>
+              <w:jc w:val="left"/>
+            </w:pPr>
+            <w:r>
+              <w:t xml:space="preserve">LSTMP (P=128)</w:t>
+            </w:r>
+          </w:p>
+        </w:tc>
+        <w:tc>
+          <w:tcPr/>
+          <w:p>
+            <w:pPr>
+              <w:pStyle w:val="Compact"/>
+              <w:jc w:val="right"/>
+            </w:pPr>
+            <w:r>
+              <w:t xml:space="preserve">2,685,314</w:t>
+            </w:r>
+          </w:p>
+        </w:tc>
+        <w:tc>
+          <w:tcPr/>
+          <w:p>
+            <w:pPr>
+              <w:pStyle w:val="Compact"/>
+              <w:jc w:val="right"/>
+            </w:pPr>
+            <w:r>
+              <w:t xml:space="preserve">296,064</w:t>
+            </w:r>
+          </w:p>
+        </w:tc>
+        <w:tc>
+          <w:tcPr/>
+          <w:p>
+            <w:pPr>
+              <w:pStyle w:val="Compact"/>
+              <w:jc w:val="right"/>
+            </w:pPr>
+            <w:r>
+              <w:t xml:space="preserve">0.8806</w:t>
+            </w:r>
+          </w:p>
+        </w:tc>
+        <w:tc>
+          <w:tcPr/>
+          <w:p>
+            <w:pPr>
+              <w:pStyle w:val="Compact"/>
+              <w:jc w:val="right"/>
+            </w:pPr>
+            <w:r>
+              <w:t xml:space="preserve">0.8526</w:t>
+            </w:r>
+          </w:p>
+        </w:tc>
+        <w:tc>
+          <w:tcPr/>
+          <w:p>
+            <w:pPr>
+              <w:pStyle w:val="Compact"/>
+              <w:jc w:val="right"/>
+            </w:pPr>
+            <w:r>
+              <w:t xml:space="preserve">0.8481</w:t>
+            </w:r>
+          </w:p>
+        </w:tc>
+        <w:tc>
+          <w:tcPr/>
+          <w:p>
+            <w:pPr>
+              <w:pStyle w:val="Compact"/>
+              <w:jc w:val="right"/>
+            </w:pPr>
+            <w:r>
+              <w:t xml:space="preserve">0.8575</w:t>
+            </w:r>
+          </w:p>
+        </w:tc>
+        <w:tc>
+          <w:tcPr/>
+          <w:p>
+            <w:pPr>
+              <w:pStyle w:val="Compact"/>
+              <w:jc w:val="right"/>
+            </w:pPr>
+            <w:r>
+              <w:t xml:space="preserve">8</w:t>
+            </w:r>
+          </w:p>
+        </w:tc>
+        <w:tc>
+          <w:tcPr/>
+          <w:p>
+            <w:pPr>
+              <w:pStyle w:val="Compact"/>
+              <w:jc w:val="right"/>
+            </w:pPr>
+            <w:r>
+              <w:t xml:space="preserve">51.2</w:t>
             </w:r>
           </w:p>
         </w:tc>
       </w:tr>
     </w:tbl>
+    <w:bookmarkEnd w:id="42"/>
     <w:p>
       <w:pPr>
+        <w:pStyle w:val="BodyText"/>
+      </w:pPr>
+      <w:r>
+        <w:t xml:space="preserve">The vanilla baseline reaches a test macro-F1 of 0.8561 (accuracy 0.8872). CIFG-LSTM reaches a test macro-F1 of 0.8614 (+0.0053 vs vanilla) with 25.0% fewer recurrent parameters and 41.1 s/epoch vs 48.6 s for vanilla; its best validation epoch is 6. LSTMP (P=128) reaches a test macro-F1 of 0.8526 (-0.0035 vs vanilla) with 24.9% fewer recurrent parameters and 51.2 s/epoch vs 48.6 s for vanilla; its best validation epoch is 8. All three cells land within 0.01 macro-F1 of each other, which a single seed cannot reliably separate, so the main finding is that neither efficiency variant loses measurable accuracy: CIFG removes the input gate (25% fewer recurrent parameters, about 15% faster epochs) and even scores slightly higher, and LSTMP keeps a 256-d cell with a 128-d recurrent state for the same budget at a small cost (-0.0035). The validation curves show the same pattern for every cell: validation loss is lowest around epoch 4 and then rises while training loss falls to about 0.02 and validation macro-F1 stays on a plateau between 0.84 and 0.87. The models overfit and become over-confident after a few epochs; selecting the checkpoint on macro-F1 rather than on loss keeps the better-ranked epochs.</w:t>
+      </w:r>
+    </w:p>
+    <w:bookmarkStart w:id="46" w:name="fig:curves"/>
+    <w:p>
+      <w:pPr>
+        <w:pStyle w:val="CaptionedFigure"/>
+      </w:pPr>
+      <w:r>
+        <w:drawing>
+          <wp:inline>
+            <wp:extent cx="4892040" cy="1710503"/>
+            <wp:effectExtent b="0" l="0" r="0" t="0"/>
+            <wp:docPr descr="" title="" id="44" name="Picture"/>
+            <a:graphic>
+              <a:graphicData uri="http://schemas.openxmlformats.org/drawingml/2006/picture">
+                <pic:pic>
+                  <pic:nvPicPr>
+                    <pic:cNvPr descr="C:/Users/EIC2000/drug-review-lstm/figures/val_curves.png" id="45" name="Picture"/>
+                    <pic:cNvPicPr>
+                      <a:picLocks noChangeArrowheads="1" noChangeAspect="1"/>
+                    </pic:cNvPicPr>
+                  </pic:nvPicPr>
+                  <pic:blipFill>
+                    <a:blip r:embed="rId43"/>
+                    <a:stretch>
+                      <a:fillRect/>
+                    </a:stretch>
+                  </pic:blipFill>
+                  <pic:spPr bwMode="auto">
+                    <a:xfrm>
+                      <a:off x="0" y="0"/>
+                      <a:ext cx="4892040" cy="1710503"/>
+                    </a:xfrm>
+                    <a:prstGeom prst="rect">
+                      <a:avLst/>
+                    </a:prstGeom>
+                    <a:noFill/>
+                    <a:ln w="9525">
+                      <a:noFill/>
+                      <a:headEnd/>
+                      <a:tailEnd/>
+                    </a:ln>
+                  </pic:spPr>
+                </pic:pic>
+              </a:graphicData>
+            </a:graphic>
+          </wp:inline>
+        </w:drawing>
+      </w:r>
+    </w:p>
+    <w:p>
+      <w:pPr>
         <w:pStyle w:val="ImageCaption"/>
       </w:pPr>
       <w:r>
+        <w:t xml:space="preserve">Figure 3: Validation loss and macro-F1 per epoch for the three cells.</w:t>
+      </w:r>
+    </w:p>
+    <w:bookmarkEnd w:id="46"/>
+    <w:bookmarkStart w:id="50" w:name="fig:params"/>
+    <w:p>
+      <w:pPr>
+        <w:pStyle w:val="CaptionedFigure"/>
+      </w:pPr>
+      <w:r>
+        <w:drawing>
+          <wp:inline>
+            <wp:extent cx="4892040" cy="1598795"/>
+            <wp:effectExtent b="0" l="0" r="0" t="0"/>
+            <wp:docPr descr="" title="" id="48" name="Picture"/>
+            <a:graphic>
+              <a:graphicData uri="http://schemas.openxmlformats.org/drawingml/2006/picture">
+                <pic:pic>
+                  <pic:nvPicPr>
+                    <pic:cNvPr descr="C:/Users/EIC2000/drug-review-lstm/figures/params_vs_f1.png" id="49" name="Picture"/>
+                    <pic:cNvPicPr>
+                      <a:picLocks noChangeArrowheads="1" noChangeAspect="1"/>
+                    </pic:cNvPicPr>
+                  </pic:nvPicPr>
+                  <pic:blipFill>
+                    <a:blip r:embed="rId47"/>
+                    <a:stretch>
+                      <a:fillRect/>
+                    </a:stretch>
+                  </pic:blipFill>
+                  <pic:spPr bwMode="auto">
+                    <a:xfrm>
+                      <a:off x="0" y="0"/>
+                      <a:ext cx="4892040" cy="1598795"/>
+                    </a:xfrm>
+                    <a:prstGeom prst="rect">
+                      <a:avLst/>
+                    </a:prstGeom>
+                    <a:noFill/>
+                    <a:ln w="9525">
+                      <a:noFill/>
+                      <a:headEnd/>
+                      <a:tailEnd/>
+                    </a:ln>
+                  </pic:spPr>
+                </pic:pic>
+              </a:graphicData>
+            </a:graphic>
+          </wp:inline>
+        </w:drawing>
+      </w:r>
+    </w:p>
+    <w:p>
+      <w:pPr>
+        <w:pStyle w:val="ImageCaption"/>
+      </w:pPr>
+      <w:r>
         <w:t xml:space="preserve">Figure 4: Recurrent-layer parameters versus test macro-F1 (the F1 axis does not start at zero).</w:t>
       </w:r>
     </w:p>
-    <w:bookmarkEnd w:id="41"/>
+    <w:bookmarkEnd w:id="50"/>
     <w:p>
       <w:pPr>
         <w:pStyle w:val="BodyText"/>
@@ -3801,88 +5196,165 @@
         <w:t xml:space="preserve"> </w:t>
       </w:r>
       <w:r>
+        <w:t xml:space="preserve">Halving the projection from P=128 to P=64 reduces the recurrent parameters from 296,064 to 214,080 (27.7% fewer) and changes test macro-F1 from 0.8526 to 0.8493 (-0.0033).</w:t>
+      </w:r>
+    </w:p>
+    <w:bookmarkEnd w:id="51"/>
+    <w:bookmarkStart w:id="56" w:name="final-model."/>
+    <w:p>
+      <w:pPr>
+        <w:pStyle w:val="Heading4"/>
+      </w:pPr>
+      <w:r>
+        <w:t xml:space="preserve">Final model.</w:t>
+      </w:r>
+    </w:p>
+    <w:p>
+      <w:pPr>
+        <w:pStyle w:val="FirstParagraph"/>
+      </w:pPr>
+      <w:r>
+        <w:t xml:space="preserve">Selecting on</w:t>
+      </w:r>
+      <w:r>
+        <w:t xml:space="preserve"> </w:t>
+      </w:r>
+      <w:r>
         <w:rPr>
           <w:b/>
           <w:bCs/>
         </w:rPr>
-        <w:t xml:space="preserve">[TO FILL AFTER RUN]</w:t>
-      </w:r>
-    </w:p>
-    <w:bookmarkEnd w:id="42"/>
-    <w:bookmarkStart w:id="44" w:name="final-model."/>
-    <w:p>
-      <w:pPr>
-        <w:pStyle w:val="Heading4"/>
-      </w:pPr>
-      <w:r>
-        <w:t xml:space="preserve">Final model.</w:t>
-      </w:r>
-    </w:p>
-    <w:p>
-      <w:pPr>
-        <w:pStyle w:val="FirstParagraph"/>
-      </w:pPr>
+        <w:t xml:space="preserve">validation</w:t>
+      </w:r>
+      <w:r>
+        <w:t xml:space="preserve"> </w:t>
+      </w:r>
+      <w:r>
+        <w:t xml:space="preserve">macro-F1 across all runs, the final model is</w:t>
+      </w:r>
+      <w:r>
+        <w:t xml:space="preserve"> </w:t>
+      </w:r>
       <w:r>
         <w:rPr>
           <w:b/>
           <w:bCs/>
         </w:rPr>
-        <w:t xml:space="preserve">[TO FILL AFTER RUN]</w:t>
-      </w:r>
-    </w:p>
-    <w:bookmarkStart w:id="43" w:name="fig:cm"/>
-    <w:tbl>
-      <w:tblPr>
-        <w:tblStyle w:val="FigureTable"/>
-        <w:tblW w:type="auto" w:w="0"/>
-        <w:jc w:val="center"/>
-        <w:tblLook w:firstRow="0" w:lastRow="0" w:firstColumn="0" w:lastColumn="0"/>
-      </w:tblPr>
-      <w:tblGrid>
-        <w:gridCol w:w="7920"/>
-      </w:tblGrid>
-      <w:tr>
-        <w:tc>
-          <w:tcPr/>
-          <w:p>
-            <w:pPr>
-              <w:jc w:val="center"/>
-            </w:pPr>
-            <w:r>
-              <w:rPr>
-                <w:b/>
-                <w:bCs/>
-              </w:rPr>
-              <w:t xml:space="preserve">[TO FILL AFTER RUN: figure confusion_matrix.png]</w:t>
-            </w:r>
-          </w:p>
-        </w:tc>
-      </w:tr>
-    </w:tbl>
-    <w:p>
-      <w:pPr>
-        <w:pStyle w:val="ImageCaption"/>
-      </w:pPr>
-      <w:r>
-        <w:t xml:space="preserve">Figure 5: Test confusion matrix of the final model (counts and row-normalized rates).</w:t>
-      </w:r>
-    </w:p>
-    <w:bookmarkEnd w:id="43"/>
-    <w:p>
-      <w:pPr>
-        <w:pStyle w:val="BodyText"/>
-      </w:pPr>
+        <w:t xml:space="preserve">cifg</w:t>
+      </w:r>
+      <w:r>
+        <w:t xml:space="preserve"> </w:t>
+      </w:r>
+      <w:r>
+        <w:t xml:space="preserve">(cell</w:t>
+      </w:r>
+      <w:r>
+        <w:t xml:space="preserve"> </w:t>
+      </w:r>
+      <w:r>
+        <w:rPr>
+          <w:rStyle w:val="VerbatimChar"/>
+        </w:rPr>
+        <w:t xml:space="preserve">cifg</w:t>
+      </w:r>
+      <w:r>
+        <w:t xml:space="preserve">, 2,685,186 trainable parameters, val macro-F1 0.8684). On the 10,000-review test set it obtains accuracy</w:t>
+      </w:r>
+      <w:r>
+        <w:t xml:space="preserve"> </w:t>
+      </w:r>
       <w:r>
         <w:rPr>
           <w:b/>
           <w:bCs/>
         </w:rPr>
-        <w:t xml:space="preserve">[TO FILL AFTER RUN]</w:t>
+        <w:t xml:space="preserve">0.8893</w:t>
+      </w:r>
+      <w:r>
+        <w:t xml:space="preserve">, macro-F1</w:t>
+      </w:r>
+      <w:r>
+        <w:t xml:space="preserve"> </w:t>
+      </w:r>
+      <w:r>
+        <w:rPr>
+          <w:b/>
+          <w:bCs/>
+        </w:rPr>
+        <w:t xml:space="preserve">0.8614</w:t>
+      </w:r>
+      <w:r>
+        <w:t xml:space="preserve">, macro precision 0.8616 and macro recall 0.8612.</w:t>
       </w:r>
     </w:p>
-    <w:bookmarkEnd w:id="44"/>
-    <w:bookmarkEnd w:id="45"/>
-    <w:bookmarkStart w:id="47" w:name="limitations-and-potential-improvements"/>
+    <w:bookmarkStart w:id="55" w:name="fig:cm"/>
+    <w:p>
+      <w:pPr>
+        <w:pStyle w:val="CaptionedFigure"/>
+      </w:pPr>
+      <w:r>
+        <w:drawing>
+          <wp:inline>
+            <wp:extent cx="2075688" cy="1941772"/>
+            <wp:effectExtent b="0" l="0" r="0" t="0"/>
+            <wp:docPr descr="" title="" id="53" name="Picture"/>
+            <a:graphic>
+              <a:graphicData uri="http://schemas.openxmlformats.org/drawingml/2006/picture">
+                <pic:pic>
+                  <pic:nvPicPr>
+                    <pic:cNvPr descr="C:/Users/EIC2000/drug-review-lstm/figures/confusion_matrix.png" id="54" name="Picture"/>
+                    <pic:cNvPicPr>
+                      <a:picLocks noChangeArrowheads="1" noChangeAspect="1"/>
+                    </pic:cNvPicPr>
+                  </pic:nvPicPr>
+                  <pic:blipFill>
+                    <a:blip r:embed="rId52"/>
+                    <a:stretch>
+                      <a:fillRect/>
+                    </a:stretch>
+                  </pic:blipFill>
+                  <pic:spPr bwMode="auto">
+                    <a:xfrm>
+                      <a:off x="0" y="0"/>
+                      <a:ext cx="2075688" cy="1941772"/>
+                    </a:xfrm>
+                    <a:prstGeom prst="rect">
+                      <a:avLst/>
+                    </a:prstGeom>
+                    <a:noFill/>
+                    <a:ln w="9525">
+                      <a:noFill/>
+                      <a:headEnd/>
+                      <a:tailEnd/>
+                    </a:ln>
+                  </pic:spPr>
+                </pic:pic>
+              </a:graphicData>
+            </a:graphic>
+          </wp:inline>
+        </w:drawing>
+      </w:r>
+    </w:p>
+    <w:p>
+      <w:pPr>
+        <w:pStyle w:val="ImageCaption"/>
+      </w:pPr>
+      <w:r>
+        <w:t xml:space="preserve">Figure 5: Test confusion matrix of the final model (counts and row-normalized rates).</w:t>
+      </w:r>
+    </w:p>
+    <w:bookmarkEnd w:id="55"/>
+    <w:p>
+      <w:pPr>
+        <w:pStyle w:val="BodyText"/>
+      </w:pPr>
+      <w:r>
+        <w:t xml:space="preserve">Recall is 79.8% on negative reviews and 92.4% on positive reviews: 556 negative reviews are predicted positive and 551 positive reviews are predicted negative. Errors are concentrated on the minority class: the two error types are almost equally frequent in absolute terms (556 vs 551), but negatives are only about 28% of the test set, so recall is about 12 points lower on negative reviews than on positive ones. A class-weighted loss or a decision threshold tuned on the validation set (Section 6) directly targets this gap.</w:t>
+      </w:r>
+    </w:p>
+    <w:bookmarkEnd w:id="56"/>
+    <w:bookmarkEnd w:id="57"/>
+    <w:bookmarkStart w:id="59" w:name="limitations-and-potential-improvements"/>
     <w:p>
       <w:pPr>
         <w:pStyle w:val="Heading1"/>
@@ -4053,7 +5525,7 @@
         <w:t xml:space="preserve">and a joint learning-rate/batch-size search would make the conclusions stronger.</w:t>
       </w:r>
     </w:p>
-    <w:bookmarkStart w:id="46" w:name="references."/>
+    <w:bookmarkStart w:id="58" w:name="references."/>
     <w:p>
       <w:pPr>
         <w:pStyle w:val="Heading4"/>
@@ -4182,8 +5654,8 @@
         <w:t xml:space="preserve">, 2018 (dataset).</w:t>
       </w:r>
     </w:p>
-    <w:bookmarkEnd w:id="46"/>
-    <w:bookmarkEnd w:id="47"/>
+    <w:bookmarkEnd w:id="58"/>
+    <w:bookmarkEnd w:id="59"/>
     <w:sectPr>
       <w:footnotePr>
         <w:numRestart w:val="eachSect"/>

</xml_diff>

<commit_message>
Fit report to 4-5 pages; add team names to notebook
- Compact report tables (short headers; hparam table drops identical param columns)
- Word export uses A4, 1.8 cm margins, 10 pt styles (5 pages, checked via Word)
- LaTeX: 10 pt, 1.8 cm margins, smaller results figures
- Team (Lab group E): Mohamed Amine Lamrid, Badr Misraoui added to the Colab notebook

Co-Authored-By: Claude Opus 5.5 <noreply@anthropic.com>
</commit_message>
<xml_diff>
--- a/report/report.docx
+++ b/report/report.docx
@@ -450,7 +450,7 @@
       <w:r>
         <w:drawing>
           <wp:inline>
-            <wp:extent cx="2770632" cy="1686330"/>
+            <wp:extent cx="3008376" cy="1831032"/>
             <wp:effectExtent b="0" l="0" r="0" t="0"/>
             <wp:docPr descr="image" title="" id="12" name="Picture"/>
             <a:graphic>
@@ -471,7 +471,7 @@
                   <pic:spPr bwMode="auto">
                     <a:xfrm>
                       <a:off x="0" y="0"/>
-                      <a:ext cx="2770632" cy="1686330"/>
+                      <a:ext cx="3008376" cy="1831032"/>
                     </a:xfrm>
                     <a:prstGeom prst="rect">
                       <a:avLst/>
@@ -495,7 +495,7 @@
       <w:r>
         <w:drawing>
           <wp:inline>
-            <wp:extent cx="2770632" cy="1735777"/>
+            <wp:extent cx="3008376" cy="1884722"/>
             <wp:effectExtent b="0" l="0" r="0" t="0"/>
             <wp:docPr descr="image" title="" id="15" name="Picture"/>
             <a:graphic>
@@ -516,7 +516,7 @@
                   <pic:spPr bwMode="auto">
                     <a:xfrm>
                       <a:off x="0" y="0"/>
-                      <a:ext cx="2770632" cy="1735777"/>
+                      <a:ext cx="3008376" cy="1884722"/>
                     </a:xfrm>
                     <a:prstGeom prst="rect">
                       <a:avLst/>
@@ -542,7 +542,7 @@
       <w:r>
         <w:drawing>
           <wp:inline>
-            <wp:extent cx="2770632" cy="1712336"/>
+            <wp:extent cx="3008376" cy="1859269"/>
             <wp:effectExtent b="0" l="0" r="0" t="0"/>
             <wp:docPr descr="image" title="" id="18" name="Picture"/>
             <a:graphic>
@@ -563,7 +563,7 @@
                   <pic:spPr bwMode="auto">
                     <a:xfrm>
                       <a:off x="0" y="0"/>
-                      <a:ext cx="2770632" cy="1712336"/>
+                      <a:ext cx="3008376" cy="1859269"/>
                     </a:xfrm>
                     <a:prstGeom prst="rect">
                       <a:avLst/>
@@ -587,7 +587,7 @@
       <w:r>
         <w:drawing>
           <wp:inline>
-            <wp:extent cx="2487168" cy="1432146"/>
+            <wp:extent cx="2706624" cy="1558511"/>
             <wp:effectExtent b="0" l="0" r="0" t="0"/>
             <wp:docPr descr="image" title="" id="21" name="Picture"/>
             <a:graphic>
@@ -608,7 +608,7 @@
                   <pic:spPr bwMode="auto">
                     <a:xfrm>
                       <a:off x="0" y="0"/>
-                      <a:ext cx="2487168" cy="1432146"/>
+                      <a:ext cx="2706624" cy="1558511"/>
                     </a:xfrm>
                     <a:prstGeom prst="rect">
                       <a:avLst/>
@@ -3545,7 +3545,7 @@
         <w:pStyle w:val="TableCaption"/>
       </w:pPr>
       <w:r>
-        <w:t xml:space="preserve">Table 2: Hyperparameter study on the vanilla LSTM (test set; model chosen on validation macro-F1).</w:t>
+        <w:t xml:space="preserve">Table 2: Hyperparameter study on the vanilla LSTM (test set; checkpoint chosen on validation macro-F1). All variants have the same 2,783,746 trainable parameters (394,240 recurrent).</w:t>
       </w:r>
     </w:p>
     <w:tbl>
@@ -3553,18 +3553,16 @@
         <w:tblStyle w:val="Table"/>
         <w:tblW w:type="auto" w:w="0"/>
         <w:tblLook w:firstRow="1" w:lastRow="0" w:firstColumn="0" w:lastColumn="0" w:noHBand="0" w:noVBand="0" w:val="0020"/>
-        <w:tblCaption w:val="Table 2: Hyperparameter study on the vanilla LSTM (test set; model chosen on validation macro-F1)."/>
+        <w:tblCaption w:val="Table 2: Hyperparameter study on the vanilla LSTM (test set; checkpoint chosen on validation macro-F1). All variants have the same 2,783,746 trainable parameters (394,240 recurrent)."/>
       </w:tblPr>
       <w:tblGrid>
-        <w:gridCol w:w="880"/>
-        <w:gridCol w:w="880"/>
-        <w:gridCol w:w="880"/>
-        <w:gridCol w:w="880"/>
-        <w:gridCol w:w="880"/>
-        <w:gridCol w:w="880"/>
-        <w:gridCol w:w="880"/>
-        <w:gridCol w:w="880"/>
-        <w:gridCol w:w="880"/>
+        <w:gridCol w:w="1131"/>
+        <w:gridCol w:w="1131"/>
+        <w:gridCol w:w="1131"/>
+        <w:gridCol w:w="1131"/>
+        <w:gridCol w:w="1131"/>
+        <w:gridCol w:w="1131"/>
+        <w:gridCol w:w="1131"/>
       </w:tblGrid>
       <w:tr>
         <w:trPr>
@@ -3598,7 +3596,7 @@
                 <w:b/>
                 <w:bCs/>
               </w:rPr>
-              <w:t xml:space="preserve">Trainable params</w:t>
+              <w:t xml:space="preserve">Acc.</w:t>
             </w:r>
           </w:p>
         </w:tc>
@@ -3614,7 +3612,7 @@
                 <w:b/>
                 <w:bCs/>
               </w:rPr>
-              <w:t xml:space="preserve">Recurrent params</w:t>
+              <w:t xml:space="preserve">Macro-F1</w:t>
             </w:r>
           </w:p>
         </w:tc>
@@ -3630,7 +3628,7 @@
                 <w:b/>
                 <w:bCs/>
               </w:rPr>
-              <w:t xml:space="preserve">Test acc.</w:t>
+              <w:t xml:space="preserve">Prec.</w:t>
             </w:r>
           </w:p>
         </w:tc>
@@ -3646,7 +3644,7 @@
                 <w:b/>
                 <w:bCs/>
               </w:rPr>
-              <w:t xml:space="preserve">Test macro-F1</w:t>
+              <w:t xml:space="preserve">Rec.</w:t>
             </w:r>
           </w:p>
         </w:tc>
@@ -3662,7 +3660,7 @@
                 <w:b/>
                 <w:bCs/>
               </w:rPr>
-              <w:t xml:space="preserve">Precision</w:t>
+              <w:t xml:space="preserve">Best ep.</w:t>
             </w:r>
           </w:p>
         </w:tc>
@@ -3678,39 +3676,7 @@
                 <w:b/>
                 <w:bCs/>
               </w:rPr>
-              <w:t xml:space="preserve">Recall</w:t>
-            </w:r>
-          </w:p>
-        </w:tc>
-        <w:tc>
-          <w:tcPr/>
-          <w:p>
-            <w:pPr>
-              <w:pStyle w:val="Compact"/>
-              <w:jc w:val="right"/>
-            </w:pPr>
-            <w:r>
-              <w:rPr>
-                <w:b/>
-                <w:bCs/>
-              </w:rPr>
-              <w:t xml:space="preserve">Best epoch</w:t>
-            </w:r>
-          </w:p>
-        </w:tc>
-        <w:tc>
-          <w:tcPr/>
-          <w:p>
-            <w:pPr>
-              <w:pStyle w:val="Compact"/>
-              <w:jc w:val="right"/>
-            </w:pPr>
-            <w:r>
-              <w:rPr>
-                <w:b/>
-                <w:bCs/>
-              </w:rPr>
-              <w:t xml:space="preserve">Time/epoch (s)</w:t>
+              <w:t xml:space="preserve">s/epoch</w:t>
             </w:r>
           </w:p>
         </w:tc>
@@ -3736,30 +3702,6 @@
               <w:jc w:val="right"/>
             </w:pPr>
             <w:r>
-              <w:t xml:space="preserve">2,783,746</w:t>
-            </w:r>
-          </w:p>
-        </w:tc>
-        <w:tc>
-          <w:tcPr/>
-          <w:p>
-            <w:pPr>
-              <w:pStyle w:val="Compact"/>
-              <w:jc w:val="right"/>
-            </w:pPr>
-            <w:r>
-              <w:t xml:space="preserve">394,240</w:t>
-            </w:r>
-          </w:p>
-        </w:tc>
-        <w:tc>
-          <w:tcPr/>
-          <w:p>
-            <w:pPr>
-              <w:pStyle w:val="Compact"/>
-              <w:jc w:val="right"/>
-            </w:pPr>
-            <w:r>
               <w:t xml:space="preserve">0.8872</w:t>
             </w:r>
           </w:p>
@@ -3846,30 +3788,6 @@
               <w:jc w:val="right"/>
             </w:pPr>
             <w:r>
-              <w:t xml:space="preserve">2,783,746</w:t>
-            </w:r>
-          </w:p>
-        </w:tc>
-        <w:tc>
-          <w:tcPr/>
-          <w:p>
-            <w:pPr>
-              <w:pStyle w:val="Compact"/>
-              <w:jc w:val="right"/>
-            </w:pPr>
-            <w:r>
-              <w:t xml:space="preserve">394,240</w:t>
-            </w:r>
-          </w:p>
-        </w:tc>
-        <w:tc>
-          <w:tcPr/>
-          <w:p>
-            <w:pPr>
-              <w:pStyle w:val="Compact"/>
-              <w:jc w:val="right"/>
-            </w:pPr>
-            <w:r>
               <w:t xml:space="preserve">0.8857</w:t>
             </w:r>
           </w:p>
@@ -3956,30 +3874,6 @@
               <w:jc w:val="right"/>
             </w:pPr>
             <w:r>
-              <w:t xml:space="preserve">2,783,746</w:t>
-            </w:r>
-          </w:p>
-        </w:tc>
-        <w:tc>
-          <w:tcPr/>
-          <w:p>
-            <w:pPr>
-              <w:pStyle w:val="Compact"/>
-              <w:jc w:val="right"/>
-            </w:pPr>
-            <w:r>
-              <w:t xml:space="preserve">394,240</w:t>
-            </w:r>
-          </w:p>
-        </w:tc>
-        <w:tc>
-          <w:tcPr/>
-          <w:p>
-            <w:pPr>
-              <w:pStyle w:val="Compact"/>
-              <w:jc w:val="right"/>
-            </w:pPr>
-            <w:r>
               <w:t xml:space="preserve">0.8632</w:t>
             </w:r>
           </w:p>
@@ -4066,30 +3960,6 @@
               <w:jc w:val="right"/>
             </w:pPr>
             <w:r>
-              <w:t xml:space="preserve">2,783,746</w:t>
-            </w:r>
-          </w:p>
-        </w:tc>
-        <w:tc>
-          <w:tcPr/>
-          <w:p>
-            <w:pPr>
-              <w:pStyle w:val="Compact"/>
-              <w:jc w:val="right"/>
-            </w:pPr>
-            <w:r>
-              <w:t xml:space="preserve">394,240</w:t>
-            </w:r>
-          </w:p>
-        </w:tc>
-        <w:tc>
-          <w:tcPr/>
-          <w:p>
-            <w:pPr>
-              <w:pStyle w:val="Compact"/>
-              <w:jc w:val="right"/>
-            </w:pPr>
-            <w:r>
               <w:t xml:space="preserve">0.8838</w:t>
             </w:r>
           </w:p>
@@ -4176,30 +4046,6 @@
               <w:jc w:val="right"/>
             </w:pPr>
             <w:r>
-              <w:t xml:space="preserve">2,783,746</w:t>
-            </w:r>
-          </w:p>
-        </w:tc>
-        <w:tc>
-          <w:tcPr/>
-          <w:p>
-            <w:pPr>
-              <w:pStyle w:val="Compact"/>
-              <w:jc w:val="right"/>
-            </w:pPr>
-            <w:r>
-              <w:t xml:space="preserve">394,240</w:t>
-            </w:r>
-          </w:p>
-        </w:tc>
-        <w:tc>
-          <w:tcPr/>
-          <w:p>
-            <w:pPr>
-              <w:pStyle w:val="Compact"/>
-              <w:jc w:val="right"/>
-            </w:pPr>
-            <w:r>
               <w:t xml:space="preserve">0.8836</w:t>
             </w:r>
           </w:p>
@@ -4275,30 +4121,6 @@
             </w:pPr>
             <w:r>
               <w:t xml:space="preserve">Orthogonal recurrent init</w:t>
-            </w:r>
-          </w:p>
-        </w:tc>
-        <w:tc>
-          <w:tcPr/>
-          <w:p>
-            <w:pPr>
-              <w:pStyle w:val="Compact"/>
-              <w:jc w:val="right"/>
-            </w:pPr>
-            <w:r>
-              <w:t xml:space="preserve">2,783,746</w:t>
-            </w:r>
-          </w:p>
-        </w:tc>
-        <w:tc>
-          <w:tcPr/>
-          <w:p>
-            <w:pPr>
-              <w:pStyle w:val="Compact"/>
-              <w:jc w:val="right"/>
-            </w:pPr>
-            <w:r>
-              <w:t xml:space="preserve">394,240</w:t>
             </w:r>
           </w:p>
         </w:tc>
@@ -4385,7 +4207,7 @@
       <w:r>
         <w:drawing>
           <wp:inline>
-            <wp:extent cx="4315968" cy="1433561"/>
+            <wp:extent cx="3886200" cy="1290812"/>
             <wp:effectExtent b="0" l="0" r="0" t="0"/>
             <wp:docPr descr="" title="" id="37" name="Picture"/>
             <a:graphic>
@@ -4406,7 +4228,7 @@
                   <pic:spPr bwMode="auto">
                     <a:xfrm>
                       <a:off x="0" y="0"/>
-                      <a:ext cx="4315968" cy="1433561"/>
+                      <a:ext cx="3886200" cy="1290812"/>
                     </a:xfrm>
                     <a:prstGeom prst="rect">
                       <a:avLst/>
@@ -4610,7 +4432,7 @@
                 <w:b/>
                 <w:bCs/>
               </w:rPr>
-              <w:t xml:space="preserve">Trainable params</w:t>
+              <w:t xml:space="preserve">Recurrent params</w:t>
             </w:r>
           </w:p>
         </w:tc>
@@ -4626,7 +4448,7 @@
                 <w:b/>
                 <w:bCs/>
               </w:rPr>
-              <w:t xml:space="preserve">Recurrent params</w:t>
+              <w:t xml:space="preserve">Total params</w:t>
             </w:r>
           </w:p>
         </w:tc>
@@ -4642,7 +4464,7 @@
                 <w:b/>
                 <w:bCs/>
               </w:rPr>
-              <w:t xml:space="preserve">Test acc.</w:t>
+              <w:t xml:space="preserve">Acc.</w:t>
             </w:r>
           </w:p>
         </w:tc>
@@ -4658,7 +4480,7 @@
                 <w:b/>
                 <w:bCs/>
               </w:rPr>
-              <w:t xml:space="preserve">Test macro-F1</w:t>
+              <w:t xml:space="preserve">Macro-F1</w:t>
             </w:r>
           </w:p>
         </w:tc>
@@ -4674,7 +4496,7 @@
                 <w:b/>
                 <w:bCs/>
               </w:rPr>
-              <w:t xml:space="preserve">Precision</w:t>
+              <w:t xml:space="preserve">Prec.</w:t>
             </w:r>
           </w:p>
         </w:tc>
@@ -4690,7 +4512,7 @@
                 <w:b/>
                 <w:bCs/>
               </w:rPr>
-              <w:t xml:space="preserve">Recall</w:t>
+              <w:t xml:space="preserve">Rec.</w:t>
             </w:r>
           </w:p>
         </w:tc>
@@ -4706,7 +4528,7 @@
                 <w:b/>
                 <w:bCs/>
               </w:rPr>
-              <w:t xml:space="preserve">Best epoch</w:t>
+              <w:t xml:space="preserve">Best ep.</w:t>
             </w:r>
           </w:p>
         </w:tc>
@@ -4722,7 +4544,7 @@
                 <w:b/>
                 <w:bCs/>
               </w:rPr>
-              <w:t xml:space="preserve">Time/epoch (s)</w:t>
+              <w:t xml:space="preserve">s/epoch</w:t>
             </w:r>
           </w:p>
         </w:tc>
@@ -4748,19 +4570,19 @@
               <w:jc w:val="right"/>
             </w:pPr>
             <w:r>
+              <w:t xml:space="preserve">394,240</w:t>
+            </w:r>
+          </w:p>
+        </w:tc>
+        <w:tc>
+          <w:tcPr/>
+          <w:p>
+            <w:pPr>
+              <w:pStyle w:val="Compact"/>
+              <w:jc w:val="right"/>
+            </w:pPr>
+            <w:r>
               <w:t xml:space="preserve">2,783,746</w:t>
-            </w:r>
-          </w:p>
-        </w:tc>
-        <w:tc>
-          <w:tcPr/>
-          <w:p>
-            <w:pPr>
-              <w:pStyle w:val="Compact"/>
-              <w:jc w:val="right"/>
-            </w:pPr>
-            <w:r>
-              <w:t xml:space="preserve">394,240</w:t>
             </w:r>
           </w:p>
         </w:tc>
@@ -4858,19 +4680,19 @@
               <w:jc w:val="right"/>
             </w:pPr>
             <w:r>
+              <w:t xml:space="preserve">295,680</w:t>
+            </w:r>
+          </w:p>
+        </w:tc>
+        <w:tc>
+          <w:tcPr/>
+          <w:p>
+            <w:pPr>
+              <w:pStyle w:val="Compact"/>
+              <w:jc w:val="right"/>
+            </w:pPr>
+            <w:r>
               <w:t xml:space="preserve">2,685,186</w:t>
-            </w:r>
-          </w:p>
-        </w:tc>
-        <w:tc>
-          <w:tcPr/>
-          <w:p>
-            <w:pPr>
-              <w:pStyle w:val="Compact"/>
-              <w:jc w:val="right"/>
-            </w:pPr>
-            <w:r>
-              <w:t xml:space="preserve">295,680</w:t>
             </w:r>
           </w:p>
         </w:tc>
@@ -4968,19 +4790,19 @@
               <w:jc w:val="right"/>
             </w:pPr>
             <w:r>
+              <w:t xml:space="preserve">296,064</w:t>
+            </w:r>
+          </w:p>
+        </w:tc>
+        <w:tc>
+          <w:tcPr/>
+          <w:p>
+            <w:pPr>
+              <w:pStyle w:val="Compact"/>
+              <w:jc w:val="right"/>
+            </w:pPr>
+            <w:r>
               <w:t xml:space="preserve">2,685,314</w:t>
-            </w:r>
-          </w:p>
-        </w:tc>
-        <w:tc>
-          <w:tcPr/>
-          <w:p>
-            <w:pPr>
-              <w:pStyle w:val="Compact"/>
-              <w:jc w:val="right"/>
-            </w:pPr>
-            <w:r>
-              <w:t xml:space="preserve">296,064</w:t>
             </w:r>
           </w:p>
         </w:tc>
@@ -5075,7 +4897,7 @@
       <w:r>
         <w:drawing>
           <wp:inline>
-            <wp:extent cx="4892040" cy="1710503"/>
+            <wp:extent cx="4507992" cy="1576220"/>
             <wp:effectExtent b="0" l="0" r="0" t="0"/>
             <wp:docPr descr="" title="" id="44" name="Picture"/>
             <a:graphic>
@@ -5096,7 +4918,7 @@
                   <pic:spPr bwMode="auto">
                     <a:xfrm>
                       <a:off x="0" y="0"/>
-                      <a:ext cx="4892040" cy="1710503"/>
+                      <a:ext cx="4507992" cy="1576220"/>
                     </a:xfrm>
                     <a:prstGeom prst="rect">
                       <a:avLst/>
@@ -5132,7 +4954,7 @@
       <w:r>
         <w:drawing>
           <wp:inline>
-            <wp:extent cx="4892040" cy="1598795"/>
+            <wp:extent cx="4507992" cy="1473282"/>
             <wp:effectExtent b="0" l="0" r="0" t="0"/>
             <wp:docPr descr="" title="" id="48" name="Picture"/>
             <a:graphic>
@@ -5153,7 +4975,7 @@
                   <pic:spPr bwMode="auto">
                     <a:xfrm>
                       <a:off x="0" y="0"/>
-                      <a:ext cx="4892040" cy="1598795"/>
+                      <a:ext cx="4507992" cy="1473282"/>
                     </a:xfrm>
                     <a:prstGeom prst="rect">
                       <a:avLst/>
@@ -5295,7 +5117,7 @@
       <w:r>
         <w:drawing>
           <wp:inline>
-            <wp:extent cx="2075688" cy="1941772"/>
+            <wp:extent cx="1874520" cy="1753583"/>
             <wp:effectExtent b="0" l="0" r="0" t="0"/>
             <wp:docPr descr="" title="" id="53" name="Picture"/>
             <a:graphic>
@@ -5316,7 +5138,7 @@
                   <pic:spPr bwMode="auto">
                     <a:xfrm>
                       <a:off x="0" y="0"/>
-                      <a:ext cx="2075688" cy="1941772"/>
+                      <a:ext cx="1874520" cy="1753583"/>
                     </a:xfrm>
                     <a:prstGeom prst="rect">
                       <a:avLst/>
@@ -5660,6 +5482,8 @@
       <w:footnotePr>
         <w:numRestart w:val="eachSect"/>
       </w:footnotePr>
+      <w:pgSz w:h="16838" w:w="11906"/>
+      <w:pgMar w:bottom="1020" w:left="1020" w:right="1020" w:top="1020"/>
     </w:sectPr>
   </w:body>
 </w:document>
@@ -5899,6 +5723,13 @@
   <w:style w:default="1" w:styleId="Normal" w:type="paragraph">
     <w:name w:val="Normal"/>
     <w:qFormat/>
+    <w:pPr>
+      <w:spacing w:after="80" w:before="0" w:line="240" w:lineRule="auto"/>
+    </w:pPr>
+    <w:rPr>
+      <w:rFonts w:ascii="Calibri" w:hAnsi="Calibri"/>
+      <w:sz w:val="20"/>
+    </w:rPr>
   </w:style>
   <w:style w:styleId="BodyText" w:type="paragraph">
     <w:name w:val="Body Text"/>
@@ -5906,22 +5737,37 @@
     <w:link w:val="BodyTextChar"/>
     <w:qFormat/>
     <w:pPr>
-      <w:spacing w:after="180" w:before="180"/>
+      <w:spacing w:after="80" w:before="0" w:line="240" w:lineRule="auto"/>
     </w:pPr>
+    <w:rPr>
+      <w:rFonts w:ascii="Calibri" w:hAnsi="Calibri"/>
+      <w:sz w:val="20"/>
+    </w:rPr>
   </w:style>
   <w:style w:customStyle="1" w:styleId="FirstParagraph" w:type="paragraph">
     <w:name w:val="First Paragraph"/>
     <w:basedOn w:val="BodyText"/>
     <w:next w:val="BodyText"/>
     <w:qFormat/>
+    <w:pPr>
+      <w:spacing w:after="80" w:before="0" w:line="240" w:lineRule="auto"/>
+    </w:pPr>
+    <w:rPr>
+      <w:rFonts w:ascii="Calibri" w:hAnsi="Calibri"/>
+      <w:sz w:val="20"/>
+    </w:rPr>
   </w:style>
   <w:style w:customStyle="1" w:styleId="Compact" w:type="paragraph">
     <w:name w:val="Compact"/>
     <w:basedOn w:val="BodyText"/>
     <w:qFormat/>
     <w:pPr>
-      <w:spacing w:after="36" w:before="36"/>
+      <w:spacing w:after="80" w:before="0" w:line="240" w:lineRule="auto"/>
     </w:pPr>
+    <w:rPr>
+      <w:rFonts w:ascii="Calibri" w:hAnsi="Calibri"/>
+      <w:sz w:val="20"/>
+    </w:rPr>
   </w:style>
   <w:style w:styleId="Title" w:type="paragraph">
     <w:name w:val="Title"/>
@@ -5932,13 +5778,13 @@
     <w:qFormat/>
     <w:rsid w:val="00A10FD9"/>
     <w:pPr>
-      <w:spacing w:after="80" w:line="240" w:lineRule="auto"/>
+      <w:spacing w:after="80" w:before="0" w:line="240" w:lineRule="auto"/>
       <w:contextualSpacing/>
       <w:jc w:val="center"/>
     </w:pPr>
     <w:rPr>
-      <w:rFonts w:asciiTheme="majorHAnsi" w:cstheme="majorBidi" w:eastAsiaTheme="majorEastAsia" w:hAnsiTheme="majorHAnsi"/>
-      <w:sz w:val="56"/>
+      <w:rFonts w:ascii="Calibri" w:asciiTheme="majorHAnsi" w:cstheme="majorBidi" w:eastAsiaTheme="majorEastAsia" w:hAnsi="Calibri" w:hAnsiTheme="majorHAnsi"/>
+      <w:sz w:val="32"/>
       <w:szCs w:val="56"/>
     </w:rPr>
   </w:style>
@@ -5966,11 +5812,12 @@
       <w:numPr>
         <w:ilvl w:val="1"/>
       </w:numPr>
+      <w:spacing w:after="80" w:before="0" w:line="240" w:lineRule="auto"/>
     </w:pPr>
     <w:rPr>
-      <w:rFonts w:cstheme="majorBidi" w:eastAsiaTheme="majorEastAsia"/>
+      <w:rFonts w:ascii="Calibri" w:cstheme="majorBidi" w:eastAsiaTheme="majorEastAsia" w:hAnsi="Calibri"/>
       <w:spacing w:val="15"/>
-      <w:sz w:val="28"/>
+      <w:sz w:val="24"/>
       <w:szCs w:val="28"/>
     </w:rPr>
   </w:style>
@@ -5996,9 +5843,11 @@
     <w:pPr>
       <w:keepNext/>
       <w:keepLines/>
+      <w:spacing w:after="80" w:before="0" w:line="240" w:lineRule="auto"/>
     </w:pPr>
     <w:rPr>
-      <w:sz w:val="24"/>
+      <w:rFonts w:ascii="Calibri" w:hAnsi="Calibri"/>
+      <w:sz w:val="20"/>
       <w:szCs w:val="24"/>
     </w:rPr>
   </w:style>
@@ -6010,9 +5859,11 @@
     <w:pPr>
       <w:keepNext/>
       <w:keepLines/>
+      <w:spacing w:after="80" w:before="0" w:line="240" w:lineRule="auto"/>
     </w:pPr>
     <w:rPr>
-      <w:sz w:val="24"/>
+      <w:rFonts w:ascii="Calibri" w:hAnsi="Calibri"/>
+      <w:sz w:val="18"/>
       <w:szCs w:val="24"/>
     </w:rPr>
   </w:style>
@@ -6024,12 +5875,13 @@
     <w:pPr>
       <w:keepNext/>
       <w:keepLines/>
-      <w:spacing w:after="0" w:before="300"/>
+      <w:spacing w:after="80" w:before="0" w:line="240" w:lineRule="auto"/>
       <w:jc w:val="center"/>
     </w:pPr>
     <w:rPr>
+      <w:rFonts w:ascii="Calibri" w:hAnsi="Calibri"/>
       <w:b/>
-      <w:sz w:val="20"/>
+      <w:sz w:val="19"/>
       <w:szCs w:val="20"/>
     </w:rPr>
   </w:style>
@@ -6041,10 +5893,11 @@
     <w:pPr>
       <w:keepNext/>
       <w:keepLines/>
-      <w:spacing w:after="300" w:before="100"/>
+      <w:spacing w:after="80" w:before="0" w:line="240" w:lineRule="auto"/>
     </w:pPr>
     <w:rPr>
-      <w:sz w:val="20"/>
+      <w:rFonts w:ascii="Calibri" w:hAnsi="Calibri"/>
+      <w:sz w:val="18"/>
       <w:szCs w:val="20"/>
     </w:rPr>
   </w:style>
@@ -6053,8 +5906,13 @@
     <w:basedOn w:val="Normal"/>
     <w:next w:val="Bibliography"/>
     <w:qFormat/>
-    <w:pPr/>
-    <w:rPr/>
+    <w:pPr>
+      <w:spacing w:after="80" w:before="0" w:line="240" w:lineRule="auto"/>
+    </w:pPr>
+    <w:rPr>
+      <w:rFonts w:ascii="Calibri" w:hAnsi="Calibri"/>
+      <w:sz w:val="18"/>
+    </w:rPr>
   </w:style>
   <w:style w:styleId="Heading1" w:type="paragraph">
     <w:name w:val="heading 1"/>
@@ -6067,13 +5925,13 @@
     <w:pPr>
       <w:keepNext/>
       <w:keepLines/>
-      <w:spacing w:after="80" w:before="360"/>
+      <w:spacing w:after="40" w:before="160" w:line="240" w:lineRule="auto"/>
       <w:outlineLvl w:val="0"/>
     </w:pPr>
     <w:rPr>
-      <w:rFonts w:asciiTheme="majorHAnsi" w:cstheme="majorBidi" w:eastAsiaTheme="majorEastAsia" w:hAnsiTheme="majorHAnsi"/>
+      <w:rFonts w:ascii="Calibri" w:asciiTheme="majorHAnsi" w:cstheme="majorBidi" w:eastAsiaTheme="majorEastAsia" w:hAnsi="Calibri" w:hAnsiTheme="majorHAnsi"/>
       <w:color w:themeColor="accent1" w:themeShade="BF" w:val="0F4761"/>
-      <w:sz w:val="40"/>
+      <w:sz w:val="25"/>
       <w:szCs w:val="40"/>
     </w:rPr>
   </w:style>
@@ -6090,13 +5948,13 @@
     <w:pPr>
       <w:keepNext/>
       <w:keepLines/>
-      <w:spacing w:after="80" w:before="160"/>
+      <w:spacing w:after="40" w:before="80" w:line="240" w:lineRule="auto"/>
       <w:outlineLvl w:val="1"/>
     </w:pPr>
     <w:rPr>
-      <w:rFonts w:asciiTheme="majorHAnsi" w:cstheme="majorBidi" w:eastAsiaTheme="majorEastAsia" w:hAnsiTheme="majorHAnsi"/>
+      <w:rFonts w:ascii="Calibri" w:asciiTheme="majorHAnsi" w:cstheme="majorBidi" w:eastAsiaTheme="majorEastAsia" w:hAnsi="Calibri" w:hAnsiTheme="majorHAnsi"/>
       <w:color w:themeColor="accent1" w:themeShade="BF" w:val="0F4761"/>
-      <w:sz w:val="32"/>
+      <w:sz w:val="22"/>
       <w:szCs w:val="32"/>
     </w:rPr>
   </w:style>
@@ -6113,13 +5971,13 @@
     <w:pPr>
       <w:keepNext/>
       <w:keepLines/>
-      <w:spacing w:after="80" w:before="160"/>
+      <w:spacing w:after="40" w:before="80" w:line="240" w:lineRule="auto"/>
       <w:outlineLvl w:val="2"/>
     </w:pPr>
     <w:rPr>
-      <w:rFonts w:cstheme="majorBidi" w:eastAsiaTheme="majorEastAsia"/>
+      <w:rFonts w:ascii="Calibri" w:cstheme="majorBidi" w:eastAsiaTheme="majorEastAsia" w:hAnsi="Calibri"/>
       <w:color w:themeColor="accent1" w:themeShade="BF" w:val="0F4761"/>
-      <w:sz w:val="28"/>
+      <w:sz w:val="21"/>
       <w:szCs w:val="28"/>
     </w:rPr>
   </w:style>
@@ -6136,14 +5994,15 @@
     <w:pPr>
       <w:keepNext/>
       <w:keepLines/>
-      <w:spacing w:after="40" w:before="80"/>
+      <w:spacing w:after="40" w:before="80" w:line="240" w:lineRule="auto"/>
       <w:outlineLvl w:val="3"/>
     </w:pPr>
     <w:rPr>
-      <w:rFonts w:cstheme="majorBidi" w:eastAsiaTheme="majorEastAsia"/>
+      <w:rFonts w:ascii="Calibri" w:cstheme="majorBidi" w:eastAsiaTheme="majorEastAsia" w:hAnsi="Calibri"/>
       <w:i/>
       <w:iCs/>
       <w:color w:themeColor="accent1" w:themeShade="BF" w:val="0F4761"/>
+      <w:sz w:val="20"/>
     </w:rPr>
   </w:style>
   <w:style w:styleId="Heading5" w:type="paragraph">
@@ -6457,10 +6316,12 @@
     <w:basedOn w:val="Normal"/>
     <w:link w:val="BodyTextChar"/>
     <w:pPr>
-      <w:spacing w:after="120" w:before="0"/>
+      <w:spacing w:after="80" w:before="0" w:line="240" w:lineRule="auto"/>
     </w:pPr>
     <w:rPr>
+      <w:rFonts w:ascii="Calibri" w:hAnsi="Calibri"/>
       <w:i/>
+      <w:sz w:val="17"/>
     </w:rPr>
   </w:style>
   <w:style w:customStyle="1" w:styleId="TableCaption" w:type="paragraph">
@@ -6468,11 +6329,23 @@
     <w:basedOn w:val="Caption"/>
     <w:pPr>
       <w:keepNext/>
+      <w:spacing w:after="80" w:before="0" w:line="240" w:lineRule="auto"/>
     </w:pPr>
+    <w:rPr>
+      <w:rFonts w:ascii="Calibri" w:hAnsi="Calibri"/>
+      <w:sz w:val="17"/>
+    </w:rPr>
   </w:style>
   <w:style w:customStyle="1" w:styleId="ImageCaption" w:type="paragraph">
     <w:name w:val="Image Caption"/>
     <w:basedOn w:val="Caption"/>
+    <w:pPr>
+      <w:spacing w:after="80" w:before="0" w:line="240" w:lineRule="auto"/>
+    </w:pPr>
+    <w:rPr>
+      <w:rFonts w:ascii="Calibri" w:hAnsi="Calibri"/>
+      <w:sz w:val="17"/>
+    </w:rPr>
   </w:style>
   <w:style w:customStyle="1" w:styleId="Figure" w:type="paragraph">
     <w:name w:val="Figure"/>

</xml_diff>